<commit_message>
docs: polish end-user tutorial
</commit_message>
<xml_diff>
--- a/docs/end-user-tutorial.docx
+++ b/docs/end-user-tutorial.docx
@@ -2,22 +2,22 @@
 <file path=word/document.xml><?xml version="1.0" encoding="utf-8"?>
 <w:document xmlns:w="http://schemas.openxmlformats.org/wordprocessingml/2006/main" xmlns:m="http://schemas.openxmlformats.org/officeDocument/2006/math" xmlns:r="http://schemas.openxmlformats.org/officeDocument/2006/relationships" xmlns:o="urn:schemas-microsoft-com:office:office" xmlns:v="urn:schemas-microsoft-com:vml" xmlns:w10="urn:schemas-microsoft-com:office:word" xmlns:a="http://schemas.openxmlformats.org/drawingml/2006/main" xmlns:pic="http://schemas.openxmlformats.org/drawingml/2006/picture" xmlns:wp="http://schemas.openxmlformats.org/drawingml/2006/wordprocessingDrawing">
   <w:body>
-    <w:bookmarkStart w:id="40" w:name="gauntlet-end-user-tutorial"/>
+    <w:bookmarkStart w:id="40" w:name="gauntlet-user-guide"/>
     <w:p>
       <w:pPr>
         <w:pStyle w:val="Heading1"/>
       </w:pPr>
       <w:r>
-        <w:t xml:space="preserve">Gauntlet End-User Tutorial</w:t>
-      </w:r>
-    </w:p>
-    <w:bookmarkStart w:id="9" w:name="what-gauntlet-does"/>
+        <w:t xml:space="preserve">Gauntlet User Guide</w:t>
+      </w:r>
+    </w:p>
+    <w:bookmarkStart w:id="9" w:name="introduction"/>
     <w:p>
       <w:pPr>
         <w:pStyle w:val="Heading2"/>
       </w:pPr>
       <w:r>
-        <w:t xml:space="preserve">What Gauntlet Does</w:t>
+        <w:t xml:space="preserve">Introduction</w:t>
       </w:r>
     </w:p>
     <w:p>
@@ -25,7 +25,7 @@
         <w:pStyle w:val="FirstParagraph"/>
       </w:pPr>
       <w:r>
-        <w:t xml:space="preserve">Gauntlet helps you prepare for the AWS Certified Developer - Associate exam (</w:t>
+        <w:t xml:space="preserve">Gauntlet is a focused study application for the AWS Certified Developer - Associate exam (</w:t>
       </w:r>
       <w:r>
         <w:rPr>
@@ -34,7 +34,7 @@
         <w:t xml:space="preserve">DVA-C02</w:t>
       </w:r>
       <w:r>
-        <w:t xml:space="preserve">).</w:t>
+        <w:t xml:space="preserve">). It is designed to help you move from setup to active practice quickly, then reinforce your learning through repeated challenge-and-feedback sessions.</w:t>
       </w:r>
     </w:p>
     <w:p>
@@ -42,7 +42,7 @@
         <w:pStyle w:val="BodyText"/>
       </w:pPr>
       <w:r>
-        <w:t xml:space="preserve">The app uses a guided study loop:</w:t>
+        <w:t xml:space="preserve">The experience follows a simple loop:</w:t>
       </w:r>
     </w:p>
     <w:p>
@@ -54,7 +54,7 @@
         </w:numPr>
       </w:pPr>
       <w:r>
-        <w:t xml:space="preserve">It builds your study route during onboarding.</w:t>
+        <w:t xml:space="preserve">Gauntlet builds your study route during onboarding.</w:t>
       </w:r>
     </w:p>
     <w:p>
@@ -66,7 +66,7 @@
         </w:numPr>
       </w:pPr>
       <w:r>
-        <w:t xml:space="preserve">It shows you today’s target on the dashboard.</w:t>
+        <w:t xml:space="preserve">The dashboard presents your current focus area.</w:t>
       </w:r>
     </w:p>
     <w:p>
@@ -78,7 +78,7 @@
         </w:numPr>
       </w:pPr>
       <w:r>
-        <w:t xml:space="preserve">Rex gives you scenario-based challenges.</w:t>
+        <w:t xml:space="preserve">Rex delivers scenario-based challenges.</w:t>
       </w:r>
     </w:p>
     <w:p>
@@ -90,7 +90,7 @@
         </w:numPr>
       </w:pPr>
       <w:r>
-        <w:t xml:space="preserve">Sage explains what you got right or wrong.</w:t>
+        <w:t xml:space="preserve">Sage explains the result of each response.</w:t>
       </w:r>
     </w:p>
     <w:p>
@@ -102,41 +102,25 @@
         </w:numPr>
       </w:pPr>
       <w:r>
-        <w:t xml:space="preserve">The app tracks your progress across the exam domains.</w:t>
+        <w:t xml:space="preserve">Your readiness and domain progress update over time.</w:t>
       </w:r>
     </w:p>
     <w:bookmarkEnd w:id="9"/>
-    <w:bookmarkStart w:id="10" w:name="before-you-start"/>
+    <w:bookmarkStart w:id="10" w:name="getting-started"/>
     <w:p>
       <w:pPr>
         <w:pStyle w:val="Heading2"/>
       </w:pPr>
       <w:r>
-        <w:t xml:space="preserve">Before You Start</w:t>
-      </w:r>
-    </w:p>
-    <w:p>
-      <w:pPr>
-        <w:pStyle w:val="Compact"/>
-        <w:numPr>
-          <w:ilvl w:val="0"/>
-          <w:numId w:val="1002"/>
-        </w:numPr>
-      </w:pPr>
-      <w:r>
-        <w:t xml:space="preserve">Open the app in your browser.</w:t>
-      </w:r>
-    </w:p>
-    <w:p>
-      <w:pPr>
-        <w:pStyle w:val="Compact"/>
-        <w:numPr>
-          <w:ilvl w:val="0"/>
-          <w:numId w:val="1002"/>
-        </w:numPr>
-      </w:pPr>
-      <w:r>
-        <w:t xml:space="preserve">On the home page, select</w:t>
+        <w:t xml:space="preserve">Getting Started</w:t>
+      </w:r>
+    </w:p>
+    <w:p>
+      <w:pPr>
+        <w:pStyle w:val="FirstParagraph"/>
+      </w:pPr>
+      <w:r>
+        <w:t xml:space="preserve">Before beginning, open the application in your browser and select</w:t>
       </w:r>
       <w:r>
         <w:t xml:space="preserve"> </w:t>
@@ -148,19 +132,18 @@
         <w:t xml:space="preserve">Start onboarding</w:t>
       </w:r>
       <w:r>
-        <w:t xml:space="preserve">.</w:t>
-      </w:r>
-    </w:p>
-    <w:p>
-      <w:pPr>
-        <w:pStyle w:val="Compact"/>
-        <w:numPr>
-          <w:ilvl w:val="0"/>
-          <w:numId w:val="1002"/>
-        </w:numPr>
-      </w:pPr>
-      <w:r>
-        <w:t xml:space="preserve">Keep the page open during onboarding so the curriculum can finish building.</w:t>
+        <w:t xml:space="preserve"> </w:t>
+      </w:r>
+      <w:r>
+        <w:t xml:space="preserve">from the home page.</w:t>
+      </w:r>
+    </w:p>
+    <w:p>
+      <w:pPr>
+        <w:pStyle w:val="BodyText"/>
+      </w:pPr>
+      <w:r>
+        <w:t xml:space="preserve">During onboarding, leave the page open until your curriculum has been generated.</w:t>
       </w:r>
     </w:p>
     <w:bookmarkEnd w:id="10"/>
@@ -178,36 +161,36 @@
         <w:pStyle w:val="FirstParagraph"/>
       </w:pPr>
       <w:r>
-        <w:t xml:space="preserve">Onboarding only takes a few steps.</w:t>
-      </w:r>
-    </w:p>
-    <w:bookmarkStart w:id="11" w:name="welcome-screen"/>
+        <w:t xml:space="preserve">Onboarding sets up your study route and prepares your dashboard.</w:t>
+      </w:r>
+    </w:p>
+    <w:bookmarkStart w:id="11" w:name="welcome"/>
     <w:p>
       <w:pPr>
         <w:pStyle w:val="Heading3"/>
       </w:pPr>
       <w:r>
-        <w:t xml:space="preserve">Welcome Screen</w:t>
-      </w:r>
-    </w:p>
-    <w:p>
-      <w:pPr>
-        <w:pStyle w:val="Compact"/>
-        <w:numPr>
-          <w:ilvl w:val="0"/>
-          <w:numId w:val="1003"/>
-        </w:numPr>
-      </w:pPr>
-      <w:r>
-        <w:t xml:space="preserve">Read the short intro.</w:t>
-      </w:r>
-    </w:p>
-    <w:p>
-      <w:pPr>
-        <w:pStyle w:val="Compact"/>
-        <w:numPr>
-          <w:ilvl w:val="0"/>
-          <w:numId w:val="1003"/>
+        <w:t xml:space="preserve">Welcome</w:t>
+      </w:r>
+    </w:p>
+    <w:p>
+      <w:pPr>
+        <w:pStyle w:val="Compact"/>
+        <w:numPr>
+          <w:ilvl w:val="0"/>
+          <w:numId w:val="1002"/>
+        </w:numPr>
+      </w:pPr>
+      <w:r>
+        <w:t xml:space="preserve">Review the short introduction.</w:t>
+      </w:r>
+    </w:p>
+    <w:p>
+      <w:pPr>
+        <w:pStyle w:val="Compact"/>
+        <w:numPr>
+          <w:ilvl w:val="0"/>
+          <w:numId w:val="1002"/>
         </w:numPr>
       </w:pPr>
       <w:r>
@@ -227,21 +210,21 @@
       </w:r>
     </w:p>
     <w:bookmarkEnd w:id="11"/>
-    <w:bookmarkStart w:id="12" w:name="exam-screen"/>
+    <w:bookmarkStart w:id="12" w:name="exam-selection"/>
     <w:p>
       <w:pPr>
         <w:pStyle w:val="Heading3"/>
       </w:pPr>
       <w:r>
-        <w:t xml:space="preserve">Exam Screen</w:t>
-      </w:r>
-    </w:p>
-    <w:p>
-      <w:pPr>
-        <w:pStyle w:val="Compact"/>
-        <w:numPr>
-          <w:ilvl w:val="0"/>
-          <w:numId w:val="1004"/>
+        <w:t xml:space="preserve">Exam Selection</w:t>
+      </w:r>
+    </w:p>
+    <w:p>
+      <w:pPr>
+        <w:pStyle w:val="Compact"/>
+        <w:numPr>
+          <w:ilvl w:val="0"/>
+          <w:numId w:val="1003"/>
         </w:numPr>
       </w:pPr>
       <w:r>
@@ -253,7 +236,7 @@
         <w:pStyle w:val="Compact"/>
         <w:numPr>
           <w:ilvl w:val="0"/>
-          <w:numId w:val="1004"/>
+          <w:numId w:val="1003"/>
         </w:numPr>
       </w:pPr>
       <w:r>
@@ -277,7 +260,7 @@
         <w:pStyle w:val="Compact"/>
         <w:numPr>
           <w:ilvl w:val="0"/>
-          <w:numId w:val="1004"/>
+          <w:numId w:val="1003"/>
         </w:numPr>
       </w:pPr>
       <w:r>
@@ -297,13 +280,13 @@
       </w:r>
     </w:p>
     <w:bookmarkEnd w:id="12"/>
-    <w:bookmarkStart w:id="13" w:name="learning-style-screen"/>
+    <w:bookmarkStart w:id="13" w:name="learning-style"/>
     <w:p>
       <w:pPr>
         <w:pStyle w:val="Heading3"/>
       </w:pPr>
       <w:r>
-        <w:t xml:space="preserve">Learning Style Screen</w:t>
+        <w:t xml:space="preserve">Learning Style</w:t>
       </w:r>
     </w:p>
     <w:p>
@@ -311,15 +294,15 @@
         <w:pStyle w:val="FirstParagraph"/>
       </w:pPr>
       <w:r>
-        <w:t xml:space="preserve">Choose the study style that fits you best:</w:t>
-      </w:r>
-    </w:p>
-    <w:p>
-      <w:pPr>
-        <w:pStyle w:val="Compact"/>
-        <w:numPr>
-          <w:ilvl w:val="0"/>
-          <w:numId w:val="1005"/>
+        <w:t xml:space="preserve">Choose the learning style that best matches how you prefer to study:</w:t>
+      </w:r>
+    </w:p>
+    <w:p>
+      <w:pPr>
+        <w:pStyle w:val="Compact"/>
+        <w:numPr>
+          <w:ilvl w:val="0"/>
+          <w:numId w:val="1004"/>
         </w:numPr>
       </w:pPr>
       <w:r>
@@ -329,15 +312,15 @@
         <w:t xml:space="preserve">Pressure drills</w:t>
       </w:r>
       <w:r>
-        <w:t xml:space="preserve">: harder scenarios first.</w:t>
-      </w:r>
-    </w:p>
-    <w:p>
-      <w:pPr>
-        <w:pStyle w:val="Compact"/>
-        <w:numPr>
-          <w:ilvl w:val="0"/>
-          <w:numId w:val="1005"/>
+        <w:t xml:space="preserve">: emphasizes harder scenarios early.</w:t>
+      </w:r>
+    </w:p>
+    <w:p>
+      <w:pPr>
+        <w:pStyle w:val="Compact"/>
+        <w:numPr>
+          <w:ilvl w:val="0"/>
+          <w:numId w:val="1004"/>
         </w:numPr>
       </w:pPr>
       <w:r>
@@ -347,15 +330,15 @@
         <w:t xml:space="preserve">Guided explanations</w:t>
       </w:r>
       <w:r>
-        <w:t xml:space="preserve">: concept-first learning.</w:t>
-      </w:r>
-    </w:p>
-    <w:p>
-      <w:pPr>
-        <w:pStyle w:val="Compact"/>
-        <w:numPr>
-          <w:ilvl w:val="0"/>
-          <w:numId w:val="1005"/>
+        <w:t xml:space="preserve">: emphasizes concept-first understanding.</w:t>
+      </w:r>
+    </w:p>
+    <w:p>
+      <w:pPr>
+        <w:pStyle w:val="Compact"/>
+        <w:numPr>
+          <w:ilvl w:val="0"/>
+          <w:numId w:val="1004"/>
         </w:numPr>
       </w:pPr>
       <w:r>
@@ -365,7 +348,7 @@
         <w:t xml:space="preserve">Mixed review</w:t>
       </w:r>
       <w:r>
-        <w:t xml:space="preserve">: balanced coverage and variety.</w:t>
+        <w:t xml:space="preserve">: balances coverage and variety.</w:t>
       </w:r>
     </w:p>
     <w:p>
@@ -373,7 +356,7 @@
         <w:pStyle w:val="FirstParagraph"/>
       </w:pPr>
       <w:r>
-        <w:t xml:space="preserve">After choosing a style, select</w:t>
+        <w:t xml:space="preserve">When you are ready, select</w:t>
       </w:r>
       <w:r>
         <w:t xml:space="preserve"> </w:t>
@@ -389,13 +372,13 @@
       </w:r>
     </w:p>
     <w:bookmarkEnd w:id="13"/>
-    <w:bookmarkStart w:id="14" w:name="agent-feed"/>
+    <w:bookmarkStart w:id="14" w:name="agent-build-feed"/>
     <w:p>
       <w:pPr>
         <w:pStyle w:val="Heading3"/>
       </w:pPr>
       <w:r>
-        <w:t xml:space="preserve">Agent Feed</w:t>
+        <w:t xml:space="preserve">Agent Build Feed</w:t>
       </w:r>
     </w:p>
     <w:p>
@@ -403,7 +386,7 @@
         <w:pStyle w:val="FirstParagraph"/>
       </w:pPr>
       <w:r>
-        <w:t xml:space="preserve">You will see a live build feed while the app prepares your route.</w:t>
+        <w:t xml:space="preserve">Gauntlet will display a live build feed while your study route is being prepared.</w:t>
       </w:r>
     </w:p>
     <w:p>
@@ -411,15 +394,15 @@
         <w:pStyle w:val="BodyText"/>
       </w:pPr>
       <w:r>
-        <w:t xml:space="preserve">The feed shows progress for:</w:t>
-      </w:r>
-    </w:p>
-    <w:p>
-      <w:pPr>
-        <w:pStyle w:val="Compact"/>
-        <w:numPr>
-          <w:ilvl w:val="0"/>
-          <w:numId w:val="1006"/>
+        <w:t xml:space="preserve">You will see progress from:</w:t>
+      </w:r>
+    </w:p>
+    <w:p>
+      <w:pPr>
+        <w:pStyle w:val="Compact"/>
+        <w:numPr>
+          <w:ilvl w:val="0"/>
+          <w:numId w:val="1005"/>
         </w:numPr>
       </w:pPr>
       <w:r>
@@ -431,7 +414,7 @@
         <w:pStyle w:val="Compact"/>
         <w:numPr>
           <w:ilvl w:val="0"/>
-          <w:numId w:val="1006"/>
+          <w:numId w:val="1005"/>
         </w:numPr>
       </w:pPr>
       <w:r>
@@ -443,7 +426,7 @@
         <w:pStyle w:val="Compact"/>
         <w:numPr>
           <w:ilvl w:val="0"/>
-          <w:numId w:val="1006"/>
+          <w:numId w:val="1005"/>
         </w:numPr>
       </w:pPr>
       <w:r>
@@ -455,7 +438,7 @@
         <w:pStyle w:val="FirstParagraph"/>
       </w:pPr>
       <w:r>
-        <w:t xml:space="preserve">This screen is non-skippable. Wait for the build to finish.</w:t>
+        <w:t xml:space="preserve">This step cannot be skipped. Wait for the process to complete.</w:t>
       </w:r>
     </w:p>
     <w:bookmarkEnd w:id="14"/>
@@ -473,27 +456,27 @@
         <w:pStyle w:val="FirstParagraph"/>
       </w:pPr>
       <w:r>
-        <w:t xml:space="preserve">When the build is done, the app shows:</w:t>
-      </w:r>
-    </w:p>
-    <w:p>
-      <w:pPr>
-        <w:pStyle w:val="Compact"/>
-        <w:numPr>
-          <w:ilvl w:val="0"/>
-          <w:numId w:val="1007"/>
-        </w:numPr>
-      </w:pPr>
-      <w:r>
-        <w:t xml:space="preserve">your exam route</w:t>
-      </w:r>
-    </w:p>
-    <w:p>
-      <w:pPr>
-        <w:pStyle w:val="Compact"/>
-        <w:numPr>
-          <w:ilvl w:val="0"/>
-          <w:numId w:val="1007"/>
+        <w:t xml:space="preserve">When the build is finished, Gauntlet presents your study route, including:</w:t>
+      </w:r>
+    </w:p>
+    <w:p>
+      <w:pPr>
+        <w:pStyle w:val="Compact"/>
+        <w:numPr>
+          <w:ilvl w:val="0"/>
+          <w:numId w:val="1006"/>
+        </w:numPr>
+      </w:pPr>
+      <w:r>
+        <w:t xml:space="preserve">the exam route</w:t>
+      </w:r>
+    </w:p>
+    <w:p>
+      <w:pPr>
+        <w:pStyle w:val="Compact"/>
+        <w:numPr>
+          <w:ilvl w:val="0"/>
+          <w:numId w:val="1006"/>
         </w:numPr>
       </w:pPr>
       <w:r>
@@ -505,7 +488,7 @@
         <w:pStyle w:val="Compact"/>
         <w:numPr>
           <w:ilvl w:val="0"/>
-          <w:numId w:val="1007"/>
+          <w:numId w:val="1006"/>
         </w:numPr>
       </w:pPr>
       <w:r>
@@ -517,7 +500,7 @@
         <w:pStyle w:val="Compact"/>
         <w:numPr>
           <w:ilvl w:val="0"/>
-          <w:numId w:val="1007"/>
+          <w:numId w:val="1006"/>
         </w:numPr>
       </w:pPr>
       <w:r>
@@ -544,7 +527,7 @@
         <w:t xml:space="preserve"> </w:t>
       </w:r>
       <w:r>
-        <w:t xml:space="preserve">to move to the dashboard.</w:t>
+        <w:t xml:space="preserve">to continue to the dashboard.</w:t>
       </w:r>
     </w:p>
     <w:bookmarkEnd w:id="15"/>
@@ -563,7 +546,7 @@
         <w:pStyle w:val="FirstParagraph"/>
       </w:pPr>
       <w:r>
-        <w:t xml:space="preserve">The dashboard is your main control center.</w:t>
+        <w:t xml:space="preserve">The dashboard is the main overview screen for your progress and next action.</w:t>
       </w:r>
     </w:p>
     <w:bookmarkStart w:id="17" w:name="readiness-score"/>
@@ -580,7 +563,7 @@
         <w:pStyle w:val="FirstParagraph"/>
       </w:pPr>
       <w:r>
-        <w:t xml:space="preserve">At the top left, you will see your</w:t>
+        <w:t xml:space="preserve">The</w:t>
       </w:r>
       <w:r>
         <w:t xml:space="preserve"> </w:t>
@@ -592,19 +575,22 @@
         <w:t xml:space="preserve">Readiness score</w:t>
       </w:r>
       <w:r>
-        <w:t xml:space="preserve">.</w:t>
-      </w:r>
-    </w:p>
-    <w:p>
-      <w:pPr>
-        <w:pStyle w:val="Compact"/>
-        <w:numPr>
-          <w:ilvl w:val="0"/>
-          <w:numId w:val="1008"/>
-        </w:numPr>
-      </w:pPr>
-      <w:r>
-        <w:t xml:space="preserve">New users start at</w:t>
+        <w:t xml:space="preserve"> </w:t>
+      </w:r>
+      <w:r>
+        <w:t xml:space="preserve">appears at the top left of the dashboard.</w:t>
+      </w:r>
+    </w:p>
+    <w:p>
+      <w:pPr>
+        <w:pStyle w:val="Compact"/>
+        <w:numPr>
+          <w:ilvl w:val="0"/>
+          <w:numId w:val="1007"/>
+        </w:numPr>
+      </w:pPr>
+      <w:r>
+        <w:t xml:space="preserve">New users begin at</w:t>
       </w:r>
       <w:r>
         <w:t xml:space="preserve"> </w:t>
@@ -624,11 +610,11 @@
         <w:pStyle w:val="Compact"/>
         <w:numPr>
           <w:ilvl w:val="0"/>
-          <w:numId w:val="1008"/>
-        </w:numPr>
-      </w:pPr>
-      <w:r>
-        <w:t xml:space="preserve">The score increases based on your performance in weighted domains.</w:t>
+          <w:numId w:val="1007"/>
+        </w:numPr>
+      </w:pPr>
+      <w:r>
+        <w:t xml:space="preserve">The score increases based on performance across weighted domains.</w:t>
       </w:r>
     </w:p>
     <w:bookmarkEnd w:id="17"/>
@@ -646,15 +632,15 @@
         <w:pStyle w:val="FirstParagraph"/>
       </w:pPr>
       <w:r>
-        <w:t xml:space="preserve">At the top right, you will see:</w:t>
-      </w:r>
-    </w:p>
-    <w:p>
-      <w:pPr>
-        <w:pStyle w:val="Compact"/>
-        <w:numPr>
-          <w:ilvl w:val="0"/>
-          <w:numId w:val="1009"/>
+        <w:t xml:space="preserve">The panel on the right highlights your current study target, including:</w:t>
+      </w:r>
+    </w:p>
+    <w:p>
+      <w:pPr>
+        <w:pStyle w:val="Compact"/>
+        <w:numPr>
+          <w:ilvl w:val="0"/>
+          <w:numId w:val="1008"/>
         </w:numPr>
       </w:pPr>
       <w:r>
@@ -666,7 +652,7 @@
         <w:pStyle w:val="Compact"/>
         <w:numPr>
           <w:ilvl w:val="0"/>
-          <w:numId w:val="1009"/>
+          <w:numId w:val="1008"/>
         </w:numPr>
       </w:pPr>
       <w:r>
@@ -678,11 +664,11 @@
         <w:pStyle w:val="Compact"/>
         <w:numPr>
           <w:ilvl w:val="0"/>
-          <w:numId w:val="1009"/>
-        </w:numPr>
-      </w:pPr>
-      <w:r>
-        <w:t xml:space="preserve">a button to begin studying</w:t>
+          <w:numId w:val="1008"/>
+        </w:numPr>
+      </w:pPr>
+      <w:r>
+        <w:t xml:space="preserve">the main action button to begin studying</w:t>
       </w:r>
     </w:p>
     <w:p>
@@ -743,11 +729,53 @@
         <w:pStyle w:val="Compact"/>
         <w:numPr>
           <w:ilvl w:val="0"/>
+          <w:numId w:val="1009"/>
+        </w:numPr>
+      </w:pPr>
+      <w:r>
+        <w:t xml:space="preserve">The first number represents your wins.</w:t>
+      </w:r>
+    </w:p>
+    <w:p>
+      <w:pPr>
+        <w:pStyle w:val="Compact"/>
+        <w:numPr>
+          <w:ilvl w:val="0"/>
+          <w:numId w:val="1009"/>
+        </w:numPr>
+      </w:pPr>
+      <w:r>
+        <w:t xml:space="preserve">The second number represents Rex’s wins.</w:t>
+      </w:r>
+    </w:p>
+    <w:bookmarkEnd w:id="19"/>
+    <w:bookmarkStart w:id="20" w:name="domain-overview"/>
+    <w:p>
+      <w:pPr>
+        <w:pStyle w:val="Heading3"/>
+      </w:pPr>
+      <w:r>
+        <w:t xml:space="preserve">Domain Overview</w:t>
+      </w:r>
+    </w:p>
+    <w:p>
+      <w:pPr>
+        <w:pStyle w:val="FirstParagraph"/>
+      </w:pPr>
+      <w:r>
+        <w:t xml:space="preserve">Each domain tile shows:</w:t>
+      </w:r>
+    </w:p>
+    <w:p>
+      <w:pPr>
+        <w:pStyle w:val="Compact"/>
+        <w:numPr>
+          <w:ilvl w:val="0"/>
           <w:numId w:val="1010"/>
         </w:numPr>
       </w:pPr>
       <w:r>
-        <w:t xml:space="preserve">The first number is your wins.</w:t>
+        <w:t xml:space="preserve">the domain name</w:t>
       </w:r>
     </w:p>
     <w:p>
@@ -759,17 +787,31 @@
         </w:numPr>
       </w:pPr>
       <w:r>
-        <w:t xml:space="preserve">The second number is Rex’s wins.</w:t>
-      </w:r>
-    </w:p>
-    <w:bookmarkEnd w:id="19"/>
-    <w:bookmarkStart w:id="20" w:name="domain-tiles"/>
-    <w:p>
-      <w:pPr>
-        <w:pStyle w:val="Heading3"/>
-      </w:pPr>
-      <w:r>
-        <w:t xml:space="preserve">Domain Tiles</w:t>
+        <w:t xml:space="preserve">the official exam weight</w:t>
+      </w:r>
+    </w:p>
+    <w:p>
+      <w:pPr>
+        <w:pStyle w:val="Compact"/>
+        <w:numPr>
+          <w:ilvl w:val="0"/>
+          <w:numId w:val="1010"/>
+        </w:numPr>
+      </w:pPr>
+      <w:r>
+        <w:t xml:space="preserve">your completion progress</w:t>
+      </w:r>
+    </w:p>
+    <w:p>
+      <w:pPr>
+        <w:pStyle w:val="Compact"/>
+        <w:numPr>
+          <w:ilvl w:val="0"/>
+          <w:numId w:val="1010"/>
+        </w:numPr>
+      </w:pPr>
+      <w:r>
+        <w:t xml:space="preserve">your correct answers compared with total Rex challenges</w:t>
       </w:r>
     </w:p>
     <w:p>
@@ -777,74 +819,18 @@
         <w:pStyle w:val="FirstParagraph"/>
       </w:pPr>
       <w:r>
-        <w:t xml:space="preserve">Each domain tile shows:</w:t>
-      </w:r>
-    </w:p>
-    <w:p>
-      <w:pPr>
-        <w:pStyle w:val="Compact"/>
-        <w:numPr>
-          <w:ilvl w:val="0"/>
-          <w:numId w:val="1011"/>
-        </w:numPr>
-      </w:pPr>
-      <w:r>
-        <w:t xml:space="preserve">the domain name</w:t>
-      </w:r>
-    </w:p>
-    <w:p>
-      <w:pPr>
-        <w:pStyle w:val="Compact"/>
-        <w:numPr>
-          <w:ilvl w:val="0"/>
-          <w:numId w:val="1011"/>
-        </w:numPr>
-      </w:pPr>
-      <w:r>
-        <w:t xml:space="preserve">the exam weight</w:t>
-      </w:r>
-    </w:p>
-    <w:p>
-      <w:pPr>
-        <w:pStyle w:val="Compact"/>
-        <w:numPr>
-          <w:ilvl w:val="0"/>
-          <w:numId w:val="1011"/>
-        </w:numPr>
-      </w:pPr>
-      <w:r>
-        <w:t xml:space="preserve">your completion bar</w:t>
-      </w:r>
-    </w:p>
-    <w:p>
-      <w:pPr>
-        <w:pStyle w:val="Compact"/>
-        <w:numPr>
-          <w:ilvl w:val="0"/>
-          <w:numId w:val="1011"/>
-        </w:numPr>
-      </w:pPr>
-      <w:r>
-        <w:t xml:space="preserve">your correct answers vs total Rex challenges</w:t>
-      </w:r>
-    </w:p>
-    <w:p>
-      <w:pPr>
-        <w:pStyle w:val="FirstParagraph"/>
-      </w:pPr>
-      <w:r>
-        <w:t xml:space="preserve">Use this area to see which parts of the exam need more work.</w:t>
+        <w:t xml:space="preserve">Use these tiles to identify stronger and weaker areas across the exam blueprint.</w:t>
       </w:r>
     </w:p>
     <w:bookmarkEnd w:id="20"/>
     <w:bookmarkEnd w:id="21"/>
-    <w:bookmarkStart w:id="27" w:name="step-3-run-a-study-session"/>
+    <w:bookmarkStart w:id="27" w:name="step-3-complete-a-study-session"/>
     <w:p>
       <w:pPr>
         <w:pStyle w:val="Heading2"/>
       </w:pPr>
       <w:r>
-        <w:t xml:space="preserve">Step 3: Run a Study Session</w:t>
+        <w:t xml:space="preserve">Step 3: Complete a Study Session</w:t>
       </w:r>
     </w:p>
     <w:p>
@@ -852,21 +838,12 @@
         <w:pStyle w:val="FirstParagraph"/>
       </w:pPr>
       <w:r>
-        <w:t xml:space="preserve">Sessions are the core learning loop in Gauntlet.</w:t>
-      </w:r>
-    </w:p>
-    <w:bookmarkStart w:id="22" w:name="what-happens-in-a-session"/>
-    <w:p>
-      <w:pPr>
-        <w:pStyle w:val="Heading3"/>
-      </w:pPr>
-      <w:r>
-        <w:t xml:space="preserve">What Happens in a Session</w:t>
-      </w:r>
-    </w:p>
-    <w:p>
-      <w:pPr>
-        <w:pStyle w:val="FirstParagraph"/>
+        <w:t xml:space="preserve">Study sessions are the core practice experience in Gauntlet.</w:t>
+      </w:r>
+    </w:p>
+    <w:p>
+      <w:pPr>
+        <w:pStyle w:val="BodyText"/>
       </w:pPr>
       <w:r>
         <w:t xml:space="preserve">Each session currently runs for</w:t>
@@ -884,32 +861,41 @@
         <w:t xml:space="preserve">.</w:t>
       </w:r>
     </w:p>
-    <w:p>
-      <w:pPr>
-        <w:pStyle w:val="BodyText"/>
-      </w:pPr>
-      <w:r>
-        <w:t xml:space="preserve">In each cycle:</w:t>
-      </w:r>
-    </w:p>
-    <w:p>
-      <w:pPr>
-        <w:pStyle w:val="Compact"/>
-        <w:numPr>
-          <w:ilvl w:val="0"/>
-          <w:numId w:val="1012"/>
-        </w:numPr>
-      </w:pPr>
-      <w:r>
-        <w:t xml:space="preserve">Rex gives you a scenario-based challenge.</w:t>
-      </w:r>
-    </w:p>
-    <w:p>
-      <w:pPr>
-        <w:pStyle w:val="Compact"/>
-        <w:numPr>
-          <w:ilvl w:val="0"/>
-          <w:numId w:val="1012"/>
+    <w:bookmarkStart w:id="22" w:name="session-flow"/>
+    <w:p>
+      <w:pPr>
+        <w:pStyle w:val="Heading3"/>
+      </w:pPr>
+      <w:r>
+        <w:t xml:space="preserve">Session Flow</w:t>
+      </w:r>
+    </w:p>
+    <w:p>
+      <w:pPr>
+        <w:pStyle w:val="FirstParagraph"/>
+      </w:pPr>
+      <w:r>
+        <w:t xml:space="preserve">During each cycle:</w:t>
+      </w:r>
+    </w:p>
+    <w:p>
+      <w:pPr>
+        <w:pStyle w:val="Compact"/>
+        <w:numPr>
+          <w:ilvl w:val="0"/>
+          <w:numId w:val="1011"/>
+        </w:numPr>
+      </w:pPr>
+      <w:r>
+        <w:t xml:space="preserve">Rex presents a scenario-based challenge.</w:t>
+      </w:r>
+    </w:p>
+    <w:p>
+      <w:pPr>
+        <w:pStyle w:val="Compact"/>
+        <w:numPr>
+          <w:ilvl w:val="0"/>
+          <w:numId w:val="1011"/>
         </w:numPr>
       </w:pPr>
       <w:r>
@@ -921,19 +907,19 @@
         <w:pStyle w:val="Compact"/>
         <w:numPr>
           <w:ilvl w:val="0"/>
-          <w:numId w:val="1012"/>
-        </w:numPr>
-      </w:pPr>
-      <w:r>
-        <w:t xml:space="preserve">You type your answer.</w:t>
-      </w:r>
-    </w:p>
-    <w:p>
-      <w:pPr>
-        <w:pStyle w:val="Compact"/>
-        <w:numPr>
-          <w:ilvl w:val="0"/>
-          <w:numId w:val="1012"/>
+          <w:numId w:val="1011"/>
+        </w:numPr>
+      </w:pPr>
+      <w:r>
+        <w:t xml:space="preserve">You enter your answer.</w:t>
+      </w:r>
+    </w:p>
+    <w:p>
+      <w:pPr>
+        <w:pStyle w:val="Compact"/>
+        <w:numPr>
+          <w:ilvl w:val="0"/>
+          <w:numId w:val="1011"/>
         </w:numPr>
       </w:pPr>
       <w:r>
@@ -957,11 +943,53 @@
         <w:pStyle w:val="Compact"/>
         <w:numPr>
           <w:ilvl w:val="0"/>
+          <w:numId w:val="1011"/>
+        </w:numPr>
+      </w:pPr>
+      <w:r>
+        <w:t xml:space="preserve">Sage evaluates your response and explains the result.</w:t>
+      </w:r>
+    </w:p>
+    <w:p>
+      <w:pPr>
+        <w:pStyle w:val="Compact"/>
+        <w:numPr>
+          <w:ilvl w:val="0"/>
+          <w:numId w:val="1011"/>
+        </w:numPr>
+      </w:pPr>
+      <w:r>
+        <w:t xml:space="preserve">You continue to the next challenge.</w:t>
+      </w:r>
+    </w:p>
+    <w:bookmarkEnd w:id="22"/>
+    <w:bookmarkStart w:id="23" w:name="understanding-the-rex-challenge-card"/>
+    <w:p>
+      <w:pPr>
+        <w:pStyle w:val="Heading3"/>
+      </w:pPr>
+      <w:r>
+        <w:t xml:space="preserve">Understanding the Rex Challenge Card</w:t>
+      </w:r>
+    </w:p>
+    <w:p>
+      <w:pPr>
+        <w:pStyle w:val="FirstParagraph"/>
+      </w:pPr>
+      <w:r>
+        <w:t xml:space="preserve">Each challenge card includes:</w:t>
+      </w:r>
+    </w:p>
+    <w:p>
+      <w:pPr>
+        <w:pStyle w:val="Compact"/>
+        <w:numPr>
+          <w:ilvl w:val="0"/>
           <w:numId w:val="1012"/>
         </w:numPr>
       </w:pPr>
       <w:r>
-        <w:t xml:space="preserve">Sage evaluates your answer and explains the result.</w:t>
+        <w:t xml:space="preserve">the domain tag</w:t>
       </w:r>
     </w:p>
     <w:p>
@@ -973,25 +1001,49 @@
         </w:numPr>
       </w:pPr>
       <w:r>
-        <w:t xml:space="preserve">You continue to the next challenge.</w:t>
-      </w:r>
-    </w:p>
-    <w:bookmarkEnd w:id="22"/>
-    <w:bookmarkStart w:id="23" w:name="reading-the-challenge-card"/>
+        <w:t xml:space="preserve">the topic tag</w:t>
+      </w:r>
+    </w:p>
+    <w:p>
+      <w:pPr>
+        <w:pStyle w:val="Compact"/>
+        <w:numPr>
+          <w:ilvl w:val="0"/>
+          <w:numId w:val="1012"/>
+        </w:numPr>
+      </w:pPr>
+      <w:r>
+        <w:t xml:space="preserve">the scenario</w:t>
+      </w:r>
+    </w:p>
+    <w:p>
+      <w:pPr>
+        <w:pStyle w:val="Compact"/>
+        <w:numPr>
+          <w:ilvl w:val="0"/>
+          <w:numId w:val="1012"/>
+        </w:numPr>
+      </w:pPr>
+      <w:r>
+        <w:t xml:space="preserve">the question</w:t>
+      </w:r>
+    </w:p>
+    <w:p>
+      <w:pPr>
+        <w:pStyle w:val="FirstParagraph"/>
+      </w:pPr>
+      <w:r>
+        <w:t xml:space="preserve">Review all parts of the prompt before answering.</w:t>
+      </w:r>
+    </w:p>
+    <w:bookmarkEnd w:id="23"/>
+    <w:bookmarkStart w:id="24" w:name="submitting-your-answer"/>
     <w:p>
       <w:pPr>
         <w:pStyle w:val="Heading3"/>
       </w:pPr>
       <w:r>
-        <w:t xml:space="preserve">Reading the Challenge Card</w:t>
-      </w:r>
-    </w:p>
-    <w:p>
-      <w:pPr>
-        <w:pStyle w:val="FirstParagraph"/>
-      </w:pPr>
-      <w:r>
-        <w:t xml:space="preserve">Each Rex card includes:</w:t>
+        <w:t xml:space="preserve">Submitting Your Answer</w:t>
       </w:r>
     </w:p>
     <w:p>
@@ -1003,7 +1055,7 @@
         </w:numPr>
       </w:pPr>
       <w:r>
-        <w:t xml:space="preserve">the domain tag</w:t>
+        <w:t xml:space="preserve">Type your response into the answer field.</w:t>
       </w:r>
     </w:p>
     <w:p>
@@ -1012,72 +1064,6 @@
         <w:numPr>
           <w:ilvl w:val="0"/>
           <w:numId w:val="1013"/>
-        </w:numPr>
-      </w:pPr>
-      <w:r>
-        <w:t xml:space="preserve">the topic tag</w:t>
-      </w:r>
-    </w:p>
-    <w:p>
-      <w:pPr>
-        <w:pStyle w:val="Compact"/>
-        <w:numPr>
-          <w:ilvl w:val="0"/>
-          <w:numId w:val="1013"/>
-        </w:numPr>
-      </w:pPr>
-      <w:r>
-        <w:t xml:space="preserve">the scenario</w:t>
-      </w:r>
-    </w:p>
-    <w:p>
-      <w:pPr>
-        <w:pStyle w:val="Compact"/>
-        <w:numPr>
-          <w:ilvl w:val="0"/>
-          <w:numId w:val="1013"/>
-        </w:numPr>
-      </w:pPr>
-      <w:r>
-        <w:t xml:space="preserve">the question</w:t>
-      </w:r>
-    </w:p>
-    <w:p>
-      <w:pPr>
-        <w:pStyle w:val="FirstParagraph"/>
-      </w:pPr>
-      <w:r>
-        <w:t xml:space="preserve">Read all parts before answering.</w:t>
-      </w:r>
-    </w:p>
-    <w:bookmarkEnd w:id="23"/>
-    <w:bookmarkStart w:id="24" w:name="submitting-an-answer"/>
-    <w:p>
-      <w:pPr>
-        <w:pStyle w:val="Heading3"/>
-      </w:pPr>
-      <w:r>
-        <w:t xml:space="preserve">Submitting an Answer</w:t>
-      </w:r>
-    </w:p>
-    <w:p>
-      <w:pPr>
-        <w:pStyle w:val="Compact"/>
-        <w:numPr>
-          <w:ilvl w:val="0"/>
-          <w:numId w:val="1014"/>
-        </w:numPr>
-      </w:pPr>
-      <w:r>
-        <w:t xml:space="preserve">Type your response in the answer box.</w:t>
-      </w:r>
-    </w:p>
-    <w:p>
-      <w:pPr>
-        <w:pStyle w:val="Compact"/>
-        <w:numPr>
-          <w:ilvl w:val="0"/>
-          <w:numId w:val="1014"/>
         </w:numPr>
       </w:pPr>
       <w:r>
@@ -1101,31 +1087,31 @@
         <w:pStyle w:val="FirstParagraph"/>
       </w:pPr>
       <w:r>
-        <w:t xml:space="preserve">Tips:</w:t>
-      </w:r>
-    </w:p>
-    <w:p>
-      <w:pPr>
-        <w:pStyle w:val="Compact"/>
-        <w:numPr>
-          <w:ilvl w:val="0"/>
-          <w:numId w:val="1015"/>
-        </w:numPr>
-      </w:pPr>
-      <w:r>
-        <w:t xml:space="preserve">The submit button stays disabled until you type something.</w:t>
-      </w:r>
-    </w:p>
-    <w:p>
-      <w:pPr>
-        <w:pStyle w:val="Compact"/>
-        <w:numPr>
-          <w:ilvl w:val="0"/>
-          <w:numId w:val="1015"/>
-        </w:numPr>
-      </w:pPr>
-      <w:r>
-        <w:t xml:space="preserve">On desktop, you can use</w:t>
+        <w:t xml:space="preserve">Helpful details:</w:t>
+      </w:r>
+    </w:p>
+    <w:p>
+      <w:pPr>
+        <w:pStyle w:val="Compact"/>
+        <w:numPr>
+          <w:ilvl w:val="0"/>
+          <w:numId w:val="1014"/>
+        </w:numPr>
+      </w:pPr>
+      <w:r>
+        <w:t xml:space="preserve">The submit button remains disabled until you enter text.</w:t>
+      </w:r>
+    </w:p>
+    <w:p>
+      <w:pPr>
+        <w:pStyle w:val="Compact"/>
+        <w:numPr>
+          <w:ilvl w:val="0"/>
+          <w:numId w:val="1014"/>
+        </w:numPr>
+      </w:pPr>
+      <w:r>
+        <w:t xml:space="preserve">On desktop, you can submit more quickly with</w:t>
       </w:r>
       <w:r>
         <w:t xml:space="preserve"> </w:t>
@@ -1152,10 +1138,7 @@
         <w:t xml:space="preserve">Command+Enter</w:t>
       </w:r>
       <w:r>
-        <w:t xml:space="preserve"> </w:t>
-      </w:r>
-      <w:r>
-        <w:t xml:space="preserve">to submit faster.</w:t>
+        <w:t xml:space="preserve">.</w:t>
       </w:r>
     </w:p>
     <w:bookmarkEnd w:id="24"/>
@@ -1173,7 +1156,7 @@
         <w:pStyle w:val="FirstParagraph"/>
       </w:pPr>
       <w:r>
-        <w:t xml:space="preserve">After you submit, Sage responds below the Rex card.</w:t>
+        <w:t xml:space="preserve">After submission, Sage appears below the Rex card and explains the outcome of your answer.</w:t>
       </w:r>
     </w:p>
     <w:p>
@@ -1181,15 +1164,15 @@
         <w:pStyle w:val="BodyText"/>
       </w:pPr>
       <w:r>
-        <w:t xml:space="preserve">You will see whether your answer was:</w:t>
-      </w:r>
-    </w:p>
-    <w:p>
-      <w:pPr>
-        <w:pStyle w:val="Compact"/>
-        <w:numPr>
-          <w:ilvl w:val="0"/>
-          <w:numId w:val="1016"/>
+        <w:t xml:space="preserve">Your response will be marked as either:</w:t>
+      </w:r>
+    </w:p>
+    <w:p>
+      <w:pPr>
+        <w:pStyle w:val="Compact"/>
+        <w:numPr>
+          <w:ilvl w:val="0"/>
+          <w:numId w:val="1015"/>
         </w:numPr>
       </w:pPr>
       <w:r>
@@ -1204,7 +1187,7 @@
         <w:pStyle w:val="Compact"/>
         <w:numPr>
           <w:ilvl w:val="0"/>
-          <w:numId w:val="1016"/>
+          <w:numId w:val="1015"/>
         </w:numPr>
       </w:pPr>
       <w:r>
@@ -1219,17 +1202,17 @@
         <w:pStyle w:val="FirstParagraph"/>
       </w:pPr>
       <w:r>
-        <w:t xml:space="preserve">Sage then explains the reasoning so you can tighten your understanding before moving on.</w:t>
+        <w:t xml:space="preserve">Read Sage’s explanation carefully. Even correct answers often include additional context that strengthens exam readiness.</w:t>
       </w:r>
     </w:p>
     <w:bookmarkEnd w:id="25"/>
-    <w:bookmarkStart w:id="26" w:name="moving-to-the-next-cycle"/>
+    <w:bookmarkStart w:id="26" w:name="continuing-the-session"/>
     <w:p>
       <w:pPr>
         <w:pStyle w:val="Heading3"/>
       </w:pPr>
       <w:r>
-        <w:t xml:space="preserve">Moving to the Next Cycle</w:t>
+        <w:t xml:space="preserve">Continuing the Session</w:t>
       </w:r>
     </w:p>
     <w:p>
@@ -1237,15 +1220,15 @@
         <w:pStyle w:val="FirstParagraph"/>
       </w:pPr>
       <w:r>
-        <w:t xml:space="preserve">After Sage finishes:</w:t>
-      </w:r>
-    </w:p>
-    <w:p>
-      <w:pPr>
-        <w:pStyle w:val="Compact"/>
-        <w:numPr>
-          <w:ilvl w:val="0"/>
-          <w:numId w:val="1017"/>
+        <w:t xml:space="preserve">Once Sage has finished responding:</w:t>
+      </w:r>
+    </w:p>
+    <w:p>
+      <w:pPr>
+        <w:pStyle w:val="Compact"/>
+        <w:numPr>
+          <w:ilvl w:val="0"/>
+          <w:numId w:val="1016"/>
         </w:numPr>
       </w:pPr>
       <w:r>
@@ -1272,7 +1255,7 @@
         <w:pStyle w:val="Compact"/>
         <w:numPr>
           <w:ilvl w:val="0"/>
-          <w:numId w:val="1017"/>
+          <w:numId w:val="1016"/>
         </w:numPr>
       </w:pPr>
       <w:r>
@@ -1304,43 +1287,43 @@
         <w:pStyle w:val="FirstParagraph"/>
       </w:pPr>
       <w:r>
-        <w:t xml:space="preserve">At the end of the session, Gauntlet shows a summary screen with:</w:t>
-      </w:r>
-    </w:p>
-    <w:p>
-      <w:pPr>
-        <w:pStyle w:val="Compact"/>
-        <w:numPr>
-          <w:ilvl w:val="0"/>
-          <w:numId w:val="1018"/>
-        </w:numPr>
-      </w:pPr>
-      <w:r>
-        <w:t xml:space="preserve">how many answers you got correct</w:t>
-      </w:r>
-    </w:p>
-    <w:p>
-      <w:pPr>
-        <w:pStyle w:val="Compact"/>
-        <w:numPr>
-          <w:ilvl w:val="0"/>
-          <w:numId w:val="1018"/>
-        </w:numPr>
-      </w:pPr>
-      <w:r>
-        <w:t xml:space="preserve">the domain you covered</w:t>
-      </w:r>
-    </w:p>
-    <w:p>
-      <w:pPr>
-        <w:pStyle w:val="Compact"/>
-        <w:numPr>
-          <w:ilvl w:val="0"/>
-          <w:numId w:val="1018"/>
-        </w:numPr>
-      </w:pPr>
-      <w:r>
-        <w:t xml:space="preserve">the result for each cycle</w:t>
+        <w:t xml:space="preserve">At the end of each session, Gauntlet displays a summary screen showing:</w:t>
+      </w:r>
+    </w:p>
+    <w:p>
+      <w:pPr>
+        <w:pStyle w:val="Compact"/>
+        <w:numPr>
+          <w:ilvl w:val="0"/>
+          <w:numId w:val="1017"/>
+        </w:numPr>
+      </w:pPr>
+      <w:r>
+        <w:t xml:space="preserve">the number of correct answers</w:t>
+      </w:r>
+    </w:p>
+    <w:p>
+      <w:pPr>
+        <w:pStyle w:val="Compact"/>
+        <w:numPr>
+          <w:ilvl w:val="0"/>
+          <w:numId w:val="1017"/>
+        </w:numPr>
+      </w:pPr>
+      <w:r>
+        <w:t xml:space="preserve">the domain covered during the session</w:t>
+      </w:r>
+    </w:p>
+    <w:p>
+      <w:pPr>
+        <w:pStyle w:val="Compact"/>
+        <w:numPr>
+          <w:ilvl w:val="0"/>
+          <w:numId w:val="1017"/>
+        </w:numPr>
+      </w:pPr>
+      <w:r>
+        <w:t xml:space="preserve">the result of each cycle</w:t>
       </w:r>
     </w:p>
     <w:p>
@@ -1348,7 +1331,7 @@
         <w:pStyle w:val="FirstParagraph"/>
       </w:pPr>
       <w:r>
-        <w:t xml:space="preserve">Select</w:t>
+        <w:t xml:space="preserve">If you want to continue practicing, select</w:t>
       </w:r>
       <w:r>
         <w:t xml:space="preserve"> </w:t>
@@ -1360,20 +1343,17 @@
         <w:t xml:space="preserve">Start another session</w:t>
       </w:r>
       <w:r>
-        <w:t xml:space="preserve"> </w:t>
-      </w:r>
-      <w:r>
-        <w:t xml:space="preserve">if you want to keep going.</w:t>
+        <w:t xml:space="preserve">.</w:t>
       </w:r>
     </w:p>
     <w:bookmarkEnd w:id="28"/>
-    <w:bookmarkStart w:id="29" w:name="step-5-check-your-progress"/>
+    <w:bookmarkStart w:id="29" w:name="step-5-review-your-progress"/>
     <w:p>
       <w:pPr>
         <w:pStyle w:val="Heading2"/>
       </w:pPr>
       <w:r>
-        <w:t xml:space="preserve">Step 5: Check Your Progress</w:t>
+        <w:t xml:space="preserve">Step 5: Review Your Progress</w:t>
       </w:r>
     </w:p>
     <w:p>
@@ -1381,7 +1361,7 @@
         <w:pStyle w:val="FirstParagraph"/>
       </w:pPr>
       <w:r>
-        <w:t xml:space="preserve">Use the</w:t>
+        <w:t xml:space="preserve">Open the</w:t>
       </w:r>
       <w:r>
         <w:t xml:space="preserve"> </w:t>
@@ -1396,7 +1376,7 @@
         <w:t xml:space="preserve"> </w:t>
       </w:r>
       <w:r>
-        <w:t xml:space="preserve">page from the main navigation.</w:t>
+        <w:t xml:space="preserve">page from the main navigation to see a broader view of your advancement.</w:t>
       </w:r>
     </w:p>
     <w:p>
@@ -1404,23 +1384,15 @@
         <w:pStyle w:val="BodyText"/>
       </w:pPr>
       <w:r>
-        <w:t xml:space="preserve">The progress map shows all four exam domains.</w:t>
-      </w:r>
-    </w:p>
-    <w:p>
-      <w:pPr>
-        <w:pStyle w:val="BodyText"/>
-      </w:pPr>
-      <w:r>
-        <w:t xml:space="preserve">For each domain, you can see:</w:t>
-      </w:r>
-    </w:p>
-    <w:p>
-      <w:pPr>
-        <w:pStyle w:val="Compact"/>
-        <w:numPr>
-          <w:ilvl w:val="0"/>
-          <w:numId w:val="1019"/>
+        <w:t xml:space="preserve">The progress map displays all four exam domains. For each domain, you can review:</w:t>
+      </w:r>
+    </w:p>
+    <w:p>
+      <w:pPr>
+        <w:pStyle w:val="Compact"/>
+        <w:numPr>
+          <w:ilvl w:val="0"/>
+          <w:numId w:val="1018"/>
         </w:numPr>
       </w:pPr>
       <w:r>
@@ -1432,7 +1404,7 @@
         <w:pStyle w:val="Compact"/>
         <w:numPr>
           <w:ilvl w:val="0"/>
-          <w:numId w:val="1019"/>
+          <w:numId w:val="1018"/>
         </w:numPr>
       </w:pPr>
       <w:r>
@@ -1444,7 +1416,7 @@
         <w:pStyle w:val="Compact"/>
         <w:numPr>
           <w:ilvl w:val="0"/>
-          <w:numId w:val="1019"/>
+          <w:numId w:val="1018"/>
         </w:numPr>
       </w:pPr>
       <w:r>
@@ -1456,7 +1428,7 @@
         <w:pStyle w:val="Compact"/>
         <w:numPr>
           <w:ilvl w:val="0"/>
-          <w:numId w:val="1019"/>
+          <w:numId w:val="1018"/>
         </w:numPr>
       </w:pPr>
       <w:r>
@@ -1477,17 +1449,17 @@
         <w:pStyle w:val="FirstParagraph"/>
       </w:pPr>
       <w:r>
-        <w:t xml:space="preserve">This page is useful for spotting weak areas and tracking improvement over time.</w:t>
+        <w:t xml:space="preserve">This page is useful for identifying gaps and measuring improvement over time.</w:t>
       </w:r>
     </w:p>
     <w:bookmarkEnd w:id="29"/>
-    <w:bookmarkStart w:id="30" w:name="navigation-basics"/>
+    <w:bookmarkStart w:id="30" w:name="navigation"/>
     <w:p>
       <w:pPr>
         <w:pStyle w:val="Heading2"/>
       </w:pPr>
       <w:r>
-        <w:t xml:space="preserve">Navigation Basics</w:t>
+        <w:t xml:space="preserve">Navigation</w:t>
       </w:r>
     </w:p>
     <w:p>
@@ -1495,15 +1467,15 @@
         <w:pStyle w:val="FirstParagraph"/>
       </w:pPr>
       <w:r>
-        <w:t xml:space="preserve">Outside of an active session, the app navigation gives you quick access to:</w:t>
-      </w:r>
-    </w:p>
-    <w:p>
-      <w:pPr>
-        <w:pStyle w:val="Compact"/>
-        <w:numPr>
-          <w:ilvl w:val="0"/>
-          <w:numId w:val="1020"/>
+        <w:t xml:space="preserve">Outside of an active session, the main navigation provides access to:</w:t>
+      </w:r>
+    </w:p>
+    <w:p>
+      <w:pPr>
+        <w:pStyle w:val="Compact"/>
+        <w:numPr>
+          <w:ilvl w:val="0"/>
+          <w:numId w:val="1019"/>
         </w:numPr>
       </w:pPr>
       <w:r>
@@ -1518,7 +1490,7 @@
         <w:pStyle w:val="Compact"/>
         <w:numPr>
           <w:ilvl w:val="0"/>
-          <w:numId w:val="1020"/>
+          <w:numId w:val="1019"/>
         </w:numPr>
       </w:pPr>
       <w:r>
@@ -1533,7 +1505,7 @@
         <w:pStyle w:val="Compact"/>
         <w:numPr>
           <w:ilvl w:val="0"/>
-          <w:numId w:val="1020"/>
+          <w:numId w:val="1019"/>
         </w:numPr>
       </w:pPr>
       <w:r>
@@ -1548,17 +1520,17 @@
         <w:pStyle w:val="FirstParagraph"/>
       </w:pPr>
       <w:r>
-        <w:t xml:space="preserve">During an active session, the experience is intentionally more focused, with fewer distractions.</w:t>
+        <w:t xml:space="preserve">During an active session, the interface becomes more focused to reduce distractions.</w:t>
       </w:r>
     </w:p>
     <w:bookmarkEnd w:id="30"/>
-    <w:bookmarkStart w:id="31" w:name="if-you-leave-mid-session"/>
+    <w:bookmarkStart w:id="31" w:name="returning-to-an-in-progress-session"/>
     <w:p>
       <w:pPr>
         <w:pStyle w:val="Heading2"/>
       </w:pPr>
       <w:r>
-        <w:t xml:space="preserve">If You Leave Mid-Session</w:t>
+        <w:t xml:space="preserve">Returning to an In-Progress Session</w:t>
       </w:r>
     </w:p>
     <w:p>
@@ -1566,7 +1538,7 @@
         <w:pStyle w:val="FirstParagraph"/>
       </w:pPr>
       <w:r>
-        <w:t xml:space="preserve">If you leave and come back later, the app attempts to restore your in-progress session automatically.</w:t>
+        <w:t xml:space="preserve">If you leave the app during a session and return later, Gauntlet attempts to restore your in-progress session automatically.</w:t>
       </w:r>
     </w:p>
     <w:p>
@@ -1574,17 +1546,17 @@
         <w:pStyle w:val="BodyText"/>
       </w:pPr>
       <w:r>
-        <w:t xml:space="preserve">That means you can usually return without losing your place.</w:t>
+        <w:t xml:space="preserve">In most cases, this allows you to continue without losing your place.</w:t>
       </w:r>
     </w:p>
     <w:bookmarkEnd w:id="31"/>
-    <w:bookmarkStart w:id="37" w:name="common-messages-and-what-to-do"/>
+    <w:bookmarkStart w:id="37" w:name="common-messages"/>
     <w:p>
       <w:pPr>
         <w:pStyle w:val="Heading2"/>
       </w:pPr>
       <w:r>
-        <w:t xml:space="preserve">Common Messages and What To Do</w:t>
+        <w:t xml:space="preserve">Common Messages</w:t>
       </w:r>
     </w:p>
     <w:bookmarkStart w:id="32" w:name="Xf17613760e232ec50407d41d82a9f4bb101c158"/>
@@ -1676,10 +1648,7 @@
         <w:t xml:space="preserve">Retry</w:t>
       </w:r>
       <w:r>
-        <w:t xml:space="preserve"> </w:t>
-      </w:r>
-      <w:r>
-        <w:t xml:space="preserve">and submit again if needed.</w:t>
+        <w:t xml:space="preserve">, then resubmit your answer if needed.</w:t>
       </w:r>
     </w:p>
     <w:bookmarkEnd w:id="34"/>
@@ -1697,7 +1666,7 @@
         <w:pStyle w:val="FirstParagraph"/>
       </w:pPr>
       <w:r>
-        <w:t xml:space="preserve">Wait a few seconds and try again.</w:t>
+        <w:t xml:space="preserve">Wait a few seconds, then try again.</w:t>
       </w:r>
     </w:p>
     <w:bookmarkEnd w:id="35"/>
@@ -1715,26 +1684,34 @@
         <w:pStyle w:val="FirstParagraph"/>
       </w:pPr>
       <w:r>
-        <w:t xml:space="preserve">The backend service may still be starting. Refresh after a short wait.</w:t>
+        <w:t xml:space="preserve">The backend service may still be starting. Refresh the page after a short wait.</w:t>
       </w:r>
     </w:p>
     <w:bookmarkEnd w:id="36"/>
     <w:bookmarkEnd w:id="37"/>
-    <w:bookmarkStart w:id="38" w:name="best-way-to-use-gauntlet"/>
+    <w:bookmarkStart w:id="38" w:name="recommended-daily-use"/>
     <w:p>
       <w:pPr>
         <w:pStyle w:val="Heading2"/>
       </w:pPr>
       <w:r>
-        <w:t xml:space="preserve">Best Way To Use Gauntlet</w:t>
-      </w:r>
-    </w:p>
-    <w:p>
-      <w:pPr>
-        <w:pStyle w:val="Compact"/>
-        <w:numPr>
-          <w:ilvl w:val="0"/>
-          <w:numId w:val="1021"/>
+        <w:t xml:space="preserve">Recommended Daily Use</w:t>
+      </w:r>
+    </w:p>
+    <w:p>
+      <w:pPr>
+        <w:pStyle w:val="FirstParagraph"/>
+      </w:pPr>
+      <w:r>
+        <w:t xml:space="preserve">For the best experience:</w:t>
+      </w:r>
+    </w:p>
+    <w:p>
+      <w:pPr>
+        <w:pStyle w:val="Compact"/>
+        <w:numPr>
+          <w:ilvl w:val="0"/>
+          <w:numId w:val="1020"/>
         </w:numPr>
       </w:pPr>
       <w:r>
@@ -1746,7 +1723,7 @@
         <w:pStyle w:val="Compact"/>
         <w:numPr>
           <w:ilvl w:val="0"/>
-          <w:numId w:val="1021"/>
+          <w:numId w:val="1020"/>
         </w:numPr>
       </w:pPr>
       <w:r>
@@ -1758,35 +1735,35 @@
         <w:pStyle w:val="Compact"/>
         <w:numPr>
           <w:ilvl w:val="0"/>
-          <w:numId w:val="1021"/>
-        </w:numPr>
-      </w:pPr>
-      <w:r>
-        <w:t xml:space="preserve">Read Sage’s explanations carefully, even when you are correct.</w:t>
-      </w:r>
-    </w:p>
-    <w:p>
-      <w:pPr>
-        <w:pStyle w:val="Compact"/>
-        <w:numPr>
-          <w:ilvl w:val="0"/>
-          <w:numId w:val="1021"/>
-        </w:numPr>
-      </w:pPr>
-      <w:r>
-        <w:t xml:space="preserve">Check the progress map to see which domain needs more attention.</w:t>
-      </w:r>
-    </w:p>
-    <w:p>
-      <w:pPr>
-        <w:pStyle w:val="Compact"/>
-        <w:numPr>
-          <w:ilvl w:val="0"/>
-          <w:numId w:val="1021"/>
-        </w:numPr>
-      </w:pPr>
-      <w:r>
-        <w:t xml:space="preserve">Repeat consistently until your readiness score improves.</w:t>
+          <w:numId w:val="1020"/>
+        </w:numPr>
+      </w:pPr>
+      <w:r>
+        <w:t xml:space="preserve">Read Sage’s explanations closely, including after correct answers.</w:t>
+      </w:r>
+    </w:p>
+    <w:p>
+      <w:pPr>
+        <w:pStyle w:val="Compact"/>
+        <w:numPr>
+          <w:ilvl w:val="0"/>
+          <w:numId w:val="1020"/>
+        </w:numPr>
+      </w:pPr>
+      <w:r>
+        <w:t xml:space="preserve">Review the progress map to identify weaker domains.</w:t>
+      </w:r>
+    </w:p>
+    <w:p>
+      <w:pPr>
+        <w:pStyle w:val="Compact"/>
+        <w:numPr>
+          <w:ilvl w:val="0"/>
+          <w:numId w:val="1020"/>
+        </w:numPr>
+      </w:pPr>
+      <w:r>
+        <w:t xml:space="preserve">Repeat consistently as your readiness score improves.</w:t>
       </w:r>
     </w:p>
     <w:bookmarkEnd w:id="38"/>
@@ -1804,7 +1781,7 @@
         <w:pStyle w:val="Compact"/>
         <w:numPr>
           <w:ilvl w:val="0"/>
-          <w:numId w:val="1022"/>
+          <w:numId w:val="1021"/>
         </w:numPr>
       </w:pPr>
       <w:r>
@@ -1816,7 +1793,7 @@
         <w:pStyle w:val="Compact"/>
         <w:numPr>
           <w:ilvl w:val="0"/>
-          <w:numId w:val="1022"/>
+          <w:numId w:val="1021"/>
         </w:numPr>
       </w:pPr>
       <w:r>
@@ -1840,7 +1817,7 @@
         <w:pStyle w:val="Compact"/>
         <w:numPr>
           <w:ilvl w:val="0"/>
-          <w:numId w:val="1022"/>
+          <w:numId w:val="1021"/>
         </w:numPr>
       </w:pPr>
       <w:r>
@@ -1852,7 +1829,7 @@
         <w:pStyle w:val="Compact"/>
         <w:numPr>
           <w:ilvl w:val="0"/>
-          <w:numId w:val="1022"/>
+          <w:numId w:val="1021"/>
         </w:numPr>
       </w:pPr>
       <w:r>
@@ -1864,7 +1841,7 @@
         <w:pStyle w:val="Compact"/>
         <w:numPr>
           <w:ilvl w:val="0"/>
-          <w:numId w:val="1022"/>
+          <w:numId w:val="1021"/>
         </w:numPr>
       </w:pPr>
       <w:r>
@@ -1876,7 +1853,7 @@
         <w:pStyle w:val="Compact"/>
         <w:numPr>
           <w:ilvl w:val="0"/>
-          <w:numId w:val="1022"/>
+          <w:numId w:val="1021"/>
         </w:numPr>
       </w:pPr>
       <w:r>
@@ -1888,7 +1865,7 @@
         <w:pStyle w:val="Compact"/>
         <w:numPr>
           <w:ilvl w:val="0"/>
-          <w:numId w:val="1022"/>
+          <w:numId w:val="1021"/>
         </w:numPr>
       </w:pPr>
       <w:r>
@@ -1900,7 +1877,7 @@
         <w:pStyle w:val="Compact"/>
         <w:numPr>
           <w:ilvl w:val="0"/>
-          <w:numId w:val="1022"/>
+          <w:numId w:val="1021"/>
         </w:numPr>
       </w:pPr>
       <w:r>
@@ -1912,23 +1889,23 @@
         <w:pStyle w:val="Compact"/>
         <w:numPr>
           <w:ilvl w:val="0"/>
-          <w:numId w:val="1022"/>
-        </w:numPr>
-      </w:pPr>
-      <w:r>
-        <w:t xml:space="preserve">Read Sage’s feedback.</w:t>
-      </w:r>
-    </w:p>
-    <w:p>
-      <w:pPr>
-        <w:pStyle w:val="Compact"/>
-        <w:numPr>
-          <w:ilvl w:val="0"/>
-          <w:numId w:val="1022"/>
-        </w:numPr>
-      </w:pPr>
-      <w:r>
-        <w:t xml:space="preserve">Review your progress.</w:t>
+          <w:numId w:val="1021"/>
+        </w:numPr>
+      </w:pPr>
+      <w:r>
+        <w:t xml:space="preserve">Review Sage’s feedback.</w:t>
+      </w:r>
+    </w:p>
+    <w:p>
+      <w:pPr>
+        <w:pStyle w:val="Compact"/>
+        <w:numPr>
+          <w:ilvl w:val="0"/>
+          <w:numId w:val="1021"/>
+        </w:numPr>
+      </w:pPr>
+      <w:r>
+        <w:t xml:space="preserve">Check your progress.</w:t>
       </w:r>
     </w:p>
     <w:bookmarkEnd w:id="39"/>
@@ -2325,34 +2302,7 @@
     </w:lvlOverride>
   </w:num>
   <w:num w:numId="1004">
-    <w:abstractNumId w:val="99411"/>
-    <w:lvlOverride w:ilvl="0">
-      <w:startOverride w:val="1"/>
-    </w:lvlOverride>
-    <w:lvlOverride w:ilvl="1">
-      <w:startOverride w:val="1"/>
-    </w:lvlOverride>
-    <w:lvlOverride w:ilvl="2">
-      <w:startOverride w:val="1"/>
-    </w:lvlOverride>
-    <w:lvlOverride w:ilvl="3">
-      <w:startOverride w:val="1"/>
-    </w:lvlOverride>
-    <w:lvlOverride w:ilvl="4">
-      <w:startOverride w:val="1"/>
-    </w:lvlOverride>
-    <w:lvlOverride w:ilvl="5">
-      <w:startOverride w:val="1"/>
-    </w:lvlOverride>
-    <w:lvlOverride w:ilvl="6">
-      <w:startOverride w:val="1"/>
-    </w:lvlOverride>
-    <w:lvlOverride w:ilvl="7">
-      <w:startOverride w:val="1"/>
-    </w:lvlOverride>
-    <w:lvlOverride w:ilvl="8">
-      <w:startOverride w:val="1"/>
-    </w:lvlOverride>
+    <w:abstractNumId w:val="991"/>
   </w:num>
   <w:num w:numId="1005">
     <w:abstractNumId w:val="991"/>
@@ -2373,9 +2323,39 @@
     <w:abstractNumId w:val="991"/>
   </w:num>
   <w:num w:numId="1011">
+    <w:abstractNumId w:val="99411"/>
+    <w:lvlOverride w:ilvl="0">
+      <w:startOverride w:val="1"/>
+    </w:lvlOverride>
+    <w:lvlOverride w:ilvl="1">
+      <w:startOverride w:val="1"/>
+    </w:lvlOverride>
+    <w:lvlOverride w:ilvl="2">
+      <w:startOverride w:val="1"/>
+    </w:lvlOverride>
+    <w:lvlOverride w:ilvl="3">
+      <w:startOverride w:val="1"/>
+    </w:lvlOverride>
+    <w:lvlOverride w:ilvl="4">
+      <w:startOverride w:val="1"/>
+    </w:lvlOverride>
+    <w:lvlOverride w:ilvl="5">
+      <w:startOverride w:val="1"/>
+    </w:lvlOverride>
+    <w:lvlOverride w:ilvl="6">
+      <w:startOverride w:val="1"/>
+    </w:lvlOverride>
+    <w:lvlOverride w:ilvl="7">
+      <w:startOverride w:val="1"/>
+    </w:lvlOverride>
+    <w:lvlOverride w:ilvl="8">
+      <w:startOverride w:val="1"/>
+    </w:lvlOverride>
+  </w:num>
+  <w:num w:numId="1012">
     <w:abstractNumId w:val="991"/>
   </w:num>
-  <w:num w:numId="1012">
+  <w:num w:numId="1013">
     <w:abstractNumId w:val="99411"/>
     <w:lvlOverride w:ilvl="0">
       <w:startOverride w:val="1"/>
@@ -2405,38 +2385,8 @@
       <w:startOverride w:val="1"/>
     </w:lvlOverride>
   </w:num>
-  <w:num w:numId="1013">
+  <w:num w:numId="1014">
     <w:abstractNumId w:val="991"/>
-  </w:num>
-  <w:num w:numId="1014">
-    <w:abstractNumId w:val="99411"/>
-    <w:lvlOverride w:ilvl="0">
-      <w:startOverride w:val="1"/>
-    </w:lvlOverride>
-    <w:lvlOverride w:ilvl="1">
-      <w:startOverride w:val="1"/>
-    </w:lvlOverride>
-    <w:lvlOverride w:ilvl="2">
-      <w:startOverride w:val="1"/>
-    </w:lvlOverride>
-    <w:lvlOverride w:ilvl="3">
-      <w:startOverride w:val="1"/>
-    </w:lvlOverride>
-    <w:lvlOverride w:ilvl="4">
-      <w:startOverride w:val="1"/>
-    </w:lvlOverride>
-    <w:lvlOverride w:ilvl="5">
-      <w:startOverride w:val="1"/>
-    </w:lvlOverride>
-    <w:lvlOverride w:ilvl="6">
-      <w:startOverride w:val="1"/>
-    </w:lvlOverride>
-    <w:lvlOverride w:ilvl="7">
-      <w:startOverride w:val="1"/>
-    </w:lvlOverride>
-    <w:lvlOverride w:ilvl="8">
-      <w:startOverride w:val="1"/>
-    </w:lvlOverride>
   </w:num>
   <w:num w:numId="1015">
     <w:abstractNumId w:val="991"/>
@@ -2454,39 +2404,36 @@
     <w:abstractNumId w:val="991"/>
   </w:num>
   <w:num w:numId="1020">
-    <w:abstractNumId w:val="991"/>
+    <w:abstractNumId w:val="99411"/>
+    <w:lvlOverride w:ilvl="0">
+      <w:startOverride w:val="1"/>
+    </w:lvlOverride>
+    <w:lvlOverride w:ilvl="1">
+      <w:startOverride w:val="1"/>
+    </w:lvlOverride>
+    <w:lvlOverride w:ilvl="2">
+      <w:startOverride w:val="1"/>
+    </w:lvlOverride>
+    <w:lvlOverride w:ilvl="3">
+      <w:startOverride w:val="1"/>
+    </w:lvlOverride>
+    <w:lvlOverride w:ilvl="4">
+      <w:startOverride w:val="1"/>
+    </w:lvlOverride>
+    <w:lvlOverride w:ilvl="5">
+      <w:startOverride w:val="1"/>
+    </w:lvlOverride>
+    <w:lvlOverride w:ilvl="6">
+      <w:startOverride w:val="1"/>
+    </w:lvlOverride>
+    <w:lvlOverride w:ilvl="7">
+      <w:startOverride w:val="1"/>
+    </w:lvlOverride>
+    <w:lvlOverride w:ilvl="8">
+      <w:startOverride w:val="1"/>
+    </w:lvlOverride>
   </w:num>
   <w:num w:numId="1021">
-    <w:abstractNumId w:val="99411"/>
-    <w:lvlOverride w:ilvl="0">
-      <w:startOverride w:val="1"/>
-    </w:lvlOverride>
-    <w:lvlOverride w:ilvl="1">
-      <w:startOverride w:val="1"/>
-    </w:lvlOverride>
-    <w:lvlOverride w:ilvl="2">
-      <w:startOverride w:val="1"/>
-    </w:lvlOverride>
-    <w:lvlOverride w:ilvl="3">
-      <w:startOverride w:val="1"/>
-    </w:lvlOverride>
-    <w:lvlOverride w:ilvl="4">
-      <w:startOverride w:val="1"/>
-    </w:lvlOverride>
-    <w:lvlOverride w:ilvl="5">
-      <w:startOverride w:val="1"/>
-    </w:lvlOverride>
-    <w:lvlOverride w:ilvl="6">
-      <w:startOverride w:val="1"/>
-    </w:lvlOverride>
-    <w:lvlOverride w:ilvl="7">
-      <w:startOverride w:val="1"/>
-    </w:lvlOverride>
-    <w:lvlOverride w:ilvl="8">
-      <w:startOverride w:val="1"/>
-    </w:lvlOverride>
-  </w:num>
-  <w:num w:numId="1022">
     <w:abstractNumId w:val="99411"/>
     <w:lvlOverride w:ilvl="0">
       <w:startOverride w:val="1"/>

</xml_diff>

<commit_message>
docs: reflect Phase 6 changes in end-user tutorial
</commit_message>
<xml_diff>
--- a/docs/end-user-tutorial.docx
+++ b/docs/end-user-tutorial.docx
@@ -2,7 +2,7 @@
 <file path=word/document.xml><?xml version="1.0" encoding="utf-8"?>
 <w:document xmlns:w="http://schemas.openxmlformats.org/wordprocessingml/2006/main" xmlns:m="http://schemas.openxmlformats.org/officeDocument/2006/math" xmlns:r="http://schemas.openxmlformats.org/officeDocument/2006/relationships" xmlns:o="urn:schemas-microsoft-com:office:office" xmlns:v="urn:schemas-microsoft-com:vml" xmlns:w10="urn:schemas-microsoft-com:office:word" xmlns:a="http://schemas.openxmlformats.org/drawingml/2006/main" xmlns:pic="http://schemas.openxmlformats.org/drawingml/2006/picture" xmlns:wp="http://schemas.openxmlformats.org/drawingml/2006/wordprocessingDrawing">
   <w:body>
-    <w:bookmarkStart w:id="40" w:name="gauntlet-user-guide"/>
+    <w:bookmarkStart w:id="41" w:name="gauntlet-user-guide"/>
     <w:p>
       <w:pPr>
         <w:pStyle w:val="Heading1"/>
@@ -90,7 +90,7 @@
         </w:numPr>
       </w:pPr>
       <w:r>
-        <w:t xml:space="preserve">Sage explains the result of each response.</w:t>
+        <w:t xml:space="preserve">Sage explains the result of each response, formatted for clarity.</w:t>
       </w:r>
     </w:p>
     <w:p>
@@ -143,6 +143,14 @@
         <w:pStyle w:val="BodyText"/>
       </w:pPr>
       <w:r>
+        <w:t xml:space="preserve">If you have already completed onboarding, the app will send you straight to the dashboard instead of showing the welcome screen. The same redirect applies to the home page once your curriculum is built.</w:t>
+      </w:r>
+    </w:p>
+    <w:p>
+      <w:pPr>
+        <w:pStyle w:val="BodyText"/>
+      </w:pPr>
+      <w:r>
         <w:t xml:space="preserve">During onboarding, leave the page open until your curriculum has been generated.</w:t>
       </w:r>
     </w:p>
@@ -532,7 +540,7 @@
     </w:p>
     <w:bookmarkEnd w:id="15"/>
     <w:bookmarkEnd w:id="16"/>
-    <w:bookmarkStart w:id="21" w:name="step-2-use-the-dashboard"/>
+    <w:bookmarkStart w:id="22" w:name="step-2-use-the-dashboard"/>
     <w:p>
       <w:pPr>
         <w:pStyle w:val="Heading2"/>
@@ -618,13 +626,13 @@
       </w:r>
     </w:p>
     <w:bookmarkEnd w:id="17"/>
-    <w:bookmarkStart w:id="18" w:name="todays-target"/>
+    <w:bookmarkStart w:id="18" w:name="next-up"/>
     <w:p>
       <w:pPr>
         <w:pStyle w:val="Heading3"/>
       </w:pPr>
       <w:r>
-        <w:t xml:space="preserve">Today’s Target</w:t>
+        <w:t xml:space="preserve">Next Up</w:t>
       </w:r>
     </w:p>
     <w:p>
@@ -632,7 +640,7 @@
         <w:pStyle w:val="FirstParagraph"/>
       </w:pPr>
       <w:r>
-        <w:t xml:space="preserve">The panel on the right highlights your current study target, including:</w:t>
+        <w:t xml:space="preserve">The amber panel on the right shows what your curriculum recommends next, including:</w:t>
       </w:r>
     </w:p>
     <w:p>
@@ -644,7 +652,7 @@
         </w:numPr>
       </w:pPr>
       <w:r>
-        <w:t xml:space="preserve">today’s domain</w:t>
+        <w:t xml:space="preserve">the next domain to focus on</w:t>
       </w:r>
     </w:p>
     <w:p>
@@ -656,7 +664,7 @@
         </w:numPr>
       </w:pPr>
       <w:r>
-        <w:t xml:space="preserve">today’s topic</w:t>
+        <w:t xml:space="preserve">the next topic to cover</w:t>
       </w:r>
     </w:p>
     <w:p>
@@ -676,32 +684,80 @@
         <w:pStyle w:val="FirstParagraph"/>
       </w:pPr>
       <w:r>
-        <w:t xml:space="preserve">Select</w:t>
+        <w:t xml:space="preserve">The action button adapts to your state:</w:t>
+      </w:r>
+    </w:p>
+    <w:p>
+      <w:pPr>
+        <w:pStyle w:val="Compact"/>
+        <w:numPr>
+          <w:ilvl w:val="0"/>
+          <w:numId w:val="1009"/>
+        </w:numPr>
+      </w:pPr>
+      <w:r>
+        <w:rPr>
+          <w:rStyle w:val="VerbatimChar"/>
+        </w:rPr>
+        <w:t xml:space="preserve">Start your first session</w:t>
       </w:r>
       <w:r>
         <w:t xml:space="preserve"> </w:t>
       </w:r>
       <w:r>
-        <w:rPr>
-          <w:rStyle w:val="VerbatimChar"/>
-        </w:rPr>
-        <w:t xml:space="preserve">Start your first session</w:t>
+        <w:t xml:space="preserve">if you have never run a session.</w:t>
+      </w:r>
+    </w:p>
+    <w:p>
+      <w:pPr>
+        <w:pStyle w:val="Compact"/>
+        <w:numPr>
+          <w:ilvl w:val="0"/>
+          <w:numId w:val="1009"/>
+        </w:numPr>
+      </w:pPr>
+      <w:r>
+        <w:rPr>
+          <w:rStyle w:val="VerbatimChar"/>
+        </w:rPr>
+        <w:t xml:space="preserve">Resume session</w:t>
       </w:r>
       <w:r>
         <w:t xml:space="preserve"> </w:t>
       </w:r>
       <w:r>
-        <w:t xml:space="preserve">to begin.</w:t>
+        <w:t xml:space="preserve">if a session is already in progress in this browser.</w:t>
+      </w:r>
+    </w:p>
+    <w:p>
+      <w:pPr>
+        <w:pStyle w:val="Compact"/>
+        <w:numPr>
+          <w:ilvl w:val="0"/>
+          <w:numId w:val="1009"/>
+        </w:numPr>
+      </w:pPr>
+      <w:r>
+        <w:rPr>
+          <w:rStyle w:val="VerbatimChar"/>
+        </w:rPr>
+        <w:t xml:space="preserve">Start another session</w:t>
+      </w:r>
+      <w:r>
+        <w:t xml:space="preserve"> </w:t>
+      </w:r>
+      <w:r>
+        <w:t xml:space="preserve">once you have completed at least one session.</w:t>
       </w:r>
     </w:p>
     <w:bookmarkEnd w:id="18"/>
-    <w:bookmarkStart w:id="19" w:name="rexs-record"/>
+    <w:bookmarkStart w:id="19" w:name="you-vs-rex"/>
     <w:p>
       <w:pPr>
         <w:pStyle w:val="Heading3"/>
       </w:pPr>
       <w:r>
-        <w:t xml:space="preserve">Rex’s Record</w:t>
+        <w:t xml:space="preserve">YOU vs REX</w:t>
       </w:r>
     </w:p>
     <w:p>
@@ -709,7 +765,7 @@
         <w:pStyle w:val="FirstParagraph"/>
       </w:pPr>
       <w:r>
-        <w:t xml:space="preserve">The dashboard also shows</w:t>
+        <w:t xml:space="preserve">The dashboard also shows your head-to-head record with Rex, labelled</w:t>
       </w:r>
       <w:r>
         <w:t xml:space="preserve"> </w:t>
@@ -718,7 +774,7 @@
         <w:rPr>
           <w:rStyle w:val="VerbatimChar"/>
         </w:rPr>
-        <w:t xml:space="preserve">Rex's record</w:t>
+        <w:t xml:space="preserve">YOU vs REX</w:t>
       </w:r>
       <w:r>
         <w:t xml:space="preserve">.</w:t>
@@ -729,7 +785,7 @@
         <w:pStyle w:val="Compact"/>
         <w:numPr>
           <w:ilvl w:val="0"/>
-          <w:numId w:val="1009"/>
+          <w:numId w:val="1010"/>
         </w:numPr>
       </w:pPr>
       <w:r>
@@ -741,7 +797,7 @@
         <w:pStyle w:val="Compact"/>
         <w:numPr>
           <w:ilvl w:val="0"/>
-          <w:numId w:val="1009"/>
+          <w:numId w:val="1010"/>
         </w:numPr>
       </w:pPr>
       <w:r>
@@ -771,7 +827,7 @@
         <w:pStyle w:val="Compact"/>
         <w:numPr>
           <w:ilvl w:val="0"/>
-          <w:numId w:val="1010"/>
+          <w:numId w:val="1011"/>
         </w:numPr>
       </w:pPr>
       <w:r>
@@ -783,7 +839,7 @@
         <w:pStyle w:val="Compact"/>
         <w:numPr>
           <w:ilvl w:val="0"/>
-          <w:numId w:val="1010"/>
+          <w:numId w:val="1011"/>
         </w:numPr>
       </w:pPr>
       <w:r>
@@ -795,7 +851,7 @@
         <w:pStyle w:val="Compact"/>
         <w:numPr>
           <w:ilvl w:val="0"/>
-          <w:numId w:val="1010"/>
+          <w:numId w:val="1011"/>
         </w:numPr>
       </w:pPr>
       <w:r>
@@ -807,7 +863,7 @@
         <w:pStyle w:val="Compact"/>
         <w:numPr>
           <w:ilvl w:val="0"/>
-          <w:numId w:val="1010"/>
+          <w:numId w:val="1011"/>
         </w:numPr>
       </w:pPr>
       <w:r>
@@ -823,8 +879,94 @@
       </w:r>
     </w:p>
     <w:bookmarkEnd w:id="20"/>
+    <w:bookmarkStart w:id="21" w:name="theme"/>
+    <w:p>
+      <w:pPr>
+        <w:pStyle w:val="Heading3"/>
+      </w:pPr>
+      <w:r>
+        <w:t xml:space="preserve">Theme</w:t>
+      </w:r>
+    </w:p>
+    <w:p>
+      <w:pPr>
+        <w:pStyle w:val="FirstParagraph"/>
+      </w:pPr>
+      <w:r>
+        <w:t xml:space="preserve">The main navigation includes a theme switcher with three options:</w:t>
+      </w:r>
+    </w:p>
+    <w:p>
+      <w:pPr>
+        <w:pStyle w:val="Compact"/>
+        <w:numPr>
+          <w:ilvl w:val="0"/>
+          <w:numId w:val="1012"/>
+        </w:numPr>
+      </w:pPr>
+      <w:r>
+        <w:rPr>
+          <w:rStyle w:val="VerbatimChar"/>
+        </w:rPr>
+        <w:t xml:space="preserve">Light</w:t>
+      </w:r>
+    </w:p>
+    <w:p>
+      <w:pPr>
+        <w:pStyle w:val="Compact"/>
+        <w:numPr>
+          <w:ilvl w:val="0"/>
+          <w:numId w:val="1012"/>
+        </w:numPr>
+      </w:pPr>
+      <w:r>
+        <w:rPr>
+          <w:rStyle w:val="VerbatimChar"/>
+        </w:rPr>
+        <w:t xml:space="preserve">Dark</w:t>
+      </w:r>
+    </w:p>
+    <w:p>
+      <w:pPr>
+        <w:pStyle w:val="Compact"/>
+        <w:numPr>
+          <w:ilvl w:val="0"/>
+          <w:numId w:val="1012"/>
+        </w:numPr>
+      </w:pPr>
+      <w:r>
+        <w:rPr>
+          <w:rStyle w:val="VerbatimChar"/>
+        </w:rPr>
+        <w:t xml:space="preserve">System</w:t>
+      </w:r>
+    </w:p>
+    <w:p>
+      <w:pPr>
+        <w:pStyle w:val="FirstParagraph"/>
+      </w:pPr>
+      <w:r>
+        <w:t xml:space="preserve">Your selection is remembered across reloads.</w:t>
+      </w:r>
+      <w:r>
+        <w:t xml:space="preserve"> </w:t>
+      </w:r>
+      <w:r>
+        <w:rPr>
+          <w:rStyle w:val="VerbatimChar"/>
+        </w:rPr>
+        <w:t xml:space="preserve">System</w:t>
+      </w:r>
+      <w:r>
+        <w:t xml:space="preserve"> </w:t>
+      </w:r>
+      <w:r>
+        <w:t xml:space="preserve">follows your operating system’s appearance.</w:t>
+      </w:r>
+    </w:p>
     <w:bookmarkEnd w:id="21"/>
-    <w:bookmarkStart w:id="27" w:name="step-3-complete-a-study-session"/>
+    <w:bookmarkEnd w:id="22"/>
+    <w:bookmarkStart w:id="28" w:name="step-3-complete-a-study-session"/>
     <w:p>
       <w:pPr>
         <w:pStyle w:val="Heading2"/>
@@ -861,7 +1003,7 @@
         <w:t xml:space="preserve">.</w:t>
       </w:r>
     </w:p>
-    <w:bookmarkStart w:id="22" w:name="session-flow"/>
+    <w:bookmarkStart w:id="23" w:name="session-flow"/>
     <w:p>
       <w:pPr>
         <w:pStyle w:val="Heading3"/>
@@ -883,7 +1025,7 @@
         <w:pStyle w:val="Compact"/>
         <w:numPr>
           <w:ilvl w:val="0"/>
-          <w:numId w:val="1011"/>
+          <w:numId w:val="1013"/>
         </w:numPr>
       </w:pPr>
       <w:r>
@@ -895,7 +1037,7 @@
         <w:pStyle w:val="Compact"/>
         <w:numPr>
           <w:ilvl w:val="0"/>
-          <w:numId w:val="1011"/>
+          <w:numId w:val="1013"/>
         </w:numPr>
       </w:pPr>
       <w:r>
@@ -907,7 +1049,7 @@
         <w:pStyle w:val="Compact"/>
         <w:numPr>
           <w:ilvl w:val="0"/>
-          <w:numId w:val="1011"/>
+          <w:numId w:val="1013"/>
         </w:numPr>
       </w:pPr>
       <w:r>
@@ -919,7 +1061,7 @@
         <w:pStyle w:val="Compact"/>
         <w:numPr>
           <w:ilvl w:val="0"/>
-          <w:numId w:val="1011"/>
+          <w:numId w:val="1013"/>
         </w:numPr>
       </w:pPr>
       <w:r>
@@ -943,7 +1085,7 @@
         <w:pStyle w:val="Compact"/>
         <w:numPr>
           <w:ilvl w:val="0"/>
-          <w:numId w:val="1011"/>
+          <w:numId w:val="1013"/>
         </w:numPr>
       </w:pPr>
       <w:r>
@@ -955,15 +1097,15 @@
         <w:pStyle w:val="Compact"/>
         <w:numPr>
           <w:ilvl w:val="0"/>
-          <w:numId w:val="1011"/>
+          <w:numId w:val="1013"/>
         </w:numPr>
       </w:pPr>
       <w:r>
         <w:t xml:space="preserve">You continue to the next challenge.</w:t>
       </w:r>
     </w:p>
-    <w:bookmarkEnd w:id="22"/>
-    <w:bookmarkStart w:id="23" w:name="understanding-the-rex-challenge-card"/>
+    <w:bookmarkEnd w:id="23"/>
+    <w:bookmarkStart w:id="24" w:name="understanding-the-rex-challenge-card"/>
     <w:p>
       <w:pPr>
         <w:pStyle w:val="Heading3"/>
@@ -985,7 +1127,7 @@
         <w:pStyle w:val="Compact"/>
         <w:numPr>
           <w:ilvl w:val="0"/>
-          <w:numId w:val="1012"/>
+          <w:numId w:val="1014"/>
         </w:numPr>
       </w:pPr>
       <w:r>
@@ -997,7 +1139,7 @@
         <w:pStyle w:val="Compact"/>
         <w:numPr>
           <w:ilvl w:val="0"/>
-          <w:numId w:val="1012"/>
+          <w:numId w:val="1014"/>
         </w:numPr>
       </w:pPr>
       <w:r>
@@ -1009,7 +1151,7 @@
         <w:pStyle w:val="Compact"/>
         <w:numPr>
           <w:ilvl w:val="0"/>
-          <w:numId w:val="1012"/>
+          <w:numId w:val="1014"/>
         </w:numPr>
       </w:pPr>
       <w:r>
@@ -1021,7 +1163,7 @@
         <w:pStyle w:val="Compact"/>
         <w:numPr>
           <w:ilvl w:val="0"/>
-          <w:numId w:val="1012"/>
+          <w:numId w:val="1014"/>
         </w:numPr>
       </w:pPr>
       <w:r>
@@ -1036,8 +1178,8 @@
         <w:t xml:space="preserve">Review all parts of the prompt before answering.</w:t>
       </w:r>
     </w:p>
-    <w:bookmarkEnd w:id="23"/>
-    <w:bookmarkStart w:id="24" w:name="submitting-your-answer"/>
+    <w:bookmarkEnd w:id="24"/>
+    <w:bookmarkStart w:id="25" w:name="submitting-your-answer"/>
     <w:p>
       <w:pPr>
         <w:pStyle w:val="Heading3"/>
@@ -1051,7 +1193,7 @@
         <w:pStyle w:val="Compact"/>
         <w:numPr>
           <w:ilvl w:val="0"/>
-          <w:numId w:val="1013"/>
+          <w:numId w:val="1015"/>
         </w:numPr>
       </w:pPr>
       <w:r>
@@ -1063,7 +1205,7 @@
         <w:pStyle w:val="Compact"/>
         <w:numPr>
           <w:ilvl w:val="0"/>
-          <w:numId w:val="1013"/>
+          <w:numId w:val="1015"/>
         </w:numPr>
       </w:pPr>
       <w:r>
@@ -1095,7 +1237,7 @@
         <w:pStyle w:val="Compact"/>
         <w:numPr>
           <w:ilvl w:val="0"/>
-          <w:numId w:val="1014"/>
+          <w:numId w:val="1016"/>
         </w:numPr>
       </w:pPr>
       <w:r>
@@ -1107,7 +1249,7 @@
         <w:pStyle w:val="Compact"/>
         <w:numPr>
           <w:ilvl w:val="0"/>
-          <w:numId w:val="1014"/>
+          <w:numId w:val="1016"/>
         </w:numPr>
       </w:pPr>
       <w:r>
@@ -1141,8 +1283,8 @@
         <w:t xml:space="preserve">.</w:t>
       </w:r>
     </w:p>
-    <w:bookmarkEnd w:id="24"/>
-    <w:bookmarkStart w:id="25" w:name="reviewing-sages-feedback"/>
+    <w:bookmarkEnd w:id="25"/>
+    <w:bookmarkStart w:id="26" w:name="reviewing-sages-feedback"/>
     <w:p>
       <w:pPr>
         <w:pStyle w:val="Heading3"/>
@@ -1172,7 +1314,7 @@
         <w:pStyle w:val="Compact"/>
         <w:numPr>
           <w:ilvl w:val="0"/>
-          <w:numId w:val="1015"/>
+          <w:numId w:val="1017"/>
         </w:numPr>
       </w:pPr>
       <w:r>
@@ -1187,7 +1329,7 @@
         <w:pStyle w:val="Compact"/>
         <w:numPr>
           <w:ilvl w:val="0"/>
-          <w:numId w:val="1015"/>
+          <w:numId w:val="1017"/>
         </w:numPr>
       </w:pPr>
       <w:r>
@@ -1202,11 +1344,19 @@
         <w:pStyle w:val="FirstParagraph"/>
       </w:pPr>
       <w:r>
+        <w:t xml:space="preserve">Sage’s response is rendered with formatted headings, lists, inline code, code blocks, and blockquotes, so explanations stay scannable even when they are detailed. Responses still stream in token-by-token as Rex’s evaluation is produced.</w:t>
+      </w:r>
+    </w:p>
+    <w:p>
+      <w:pPr>
+        <w:pStyle w:val="BodyText"/>
+      </w:pPr>
+      <w:r>
         <w:t xml:space="preserve">Read Sage’s explanation carefully. Even correct answers often include additional context that strengthens exam readiness.</w:t>
       </w:r>
     </w:p>
-    <w:bookmarkEnd w:id="25"/>
-    <w:bookmarkStart w:id="26" w:name="continuing-the-session"/>
+    <w:bookmarkEnd w:id="26"/>
+    <w:bookmarkStart w:id="27" w:name="continuing-the-session"/>
     <w:p>
       <w:pPr>
         <w:pStyle w:val="Heading3"/>
@@ -1228,7 +1378,7 @@
         <w:pStyle w:val="Compact"/>
         <w:numPr>
           <w:ilvl w:val="0"/>
-          <w:numId w:val="1016"/>
+          <w:numId w:val="1018"/>
         </w:numPr>
       </w:pPr>
       <w:r>
@@ -1255,7 +1405,7 @@
         <w:pStyle w:val="Compact"/>
         <w:numPr>
           <w:ilvl w:val="0"/>
-          <w:numId w:val="1016"/>
+          <w:numId w:val="1018"/>
         </w:numPr>
       </w:pPr>
       <w:r>
@@ -1271,9 +1421,9 @@
         <w:t xml:space="preserve">View session summary</w:t>
       </w:r>
     </w:p>
-    <w:bookmarkEnd w:id="26"/>
     <w:bookmarkEnd w:id="27"/>
-    <w:bookmarkStart w:id="28" w:name="step-4-review-the-session-summary"/>
+    <w:bookmarkEnd w:id="28"/>
+    <w:bookmarkStart w:id="29" w:name="step-4-review-the-session-summary"/>
     <w:p>
       <w:pPr>
         <w:pStyle w:val="Heading2"/>
@@ -1295,7 +1445,7 @@
         <w:pStyle w:val="Compact"/>
         <w:numPr>
           <w:ilvl w:val="0"/>
-          <w:numId w:val="1017"/>
+          <w:numId w:val="1019"/>
         </w:numPr>
       </w:pPr>
       <w:r>
@@ -1307,7 +1457,7 @@
         <w:pStyle w:val="Compact"/>
         <w:numPr>
           <w:ilvl w:val="0"/>
-          <w:numId w:val="1017"/>
+          <w:numId w:val="1019"/>
         </w:numPr>
       </w:pPr>
       <w:r>
@@ -1319,7 +1469,7 @@
         <w:pStyle w:val="Compact"/>
         <w:numPr>
           <w:ilvl w:val="0"/>
-          <w:numId w:val="1017"/>
+          <w:numId w:val="1019"/>
         </w:numPr>
       </w:pPr>
       <w:r>
@@ -1331,29 +1481,422 @@
         <w:pStyle w:val="FirstParagraph"/>
       </w:pPr>
       <w:r>
-        <w:t xml:space="preserve">If you want to continue practicing, select</w:t>
+        <w:t xml:space="preserve">Two actions are available:</w:t>
+      </w:r>
+    </w:p>
+    <w:p>
+      <w:pPr>
+        <w:pStyle w:val="Compact"/>
+        <w:numPr>
+          <w:ilvl w:val="0"/>
+          <w:numId w:val="1020"/>
+        </w:numPr>
+      </w:pPr>
+      <w:r>
+        <w:rPr>
+          <w:rStyle w:val="VerbatimChar"/>
+        </w:rPr>
+        <w:t xml:space="preserve">Start another session</w:t>
       </w:r>
       <w:r>
         <w:t xml:space="preserve"> </w:t>
       </w:r>
       <w:r>
-        <w:rPr>
-          <w:rStyle w:val="VerbatimChar"/>
-        </w:rPr>
-        <w:t xml:space="preserve">Start another session</w:t>
+        <w:t xml:space="preserve">(primary) - begin a new session on the next topic.</w:t>
+      </w:r>
+    </w:p>
+    <w:p>
+      <w:pPr>
+        <w:pStyle w:val="Compact"/>
+        <w:numPr>
+          <w:ilvl w:val="0"/>
+          <w:numId w:val="1020"/>
+        </w:numPr>
+      </w:pPr>
+      <w:r>
+        <w:rPr>
+          <w:rStyle w:val="VerbatimChar"/>
+        </w:rPr>
+        <w:t xml:space="preserve">Back to dashboard</w:t>
+      </w:r>
+      <w:r>
+        <w:t xml:space="preserve"> </w:t>
+      </w:r>
+      <w:r>
+        <w:t xml:space="preserve">(secondary) - return to the dashboard without starting a new session.</w:t>
+      </w:r>
+    </w:p>
+    <w:bookmarkEnd w:id="29"/>
+    <w:bookmarkStart w:id="30" w:name="step-5-review-your-progress"/>
+    <w:p>
+      <w:pPr>
+        <w:pStyle w:val="Heading2"/>
+      </w:pPr>
+      <w:r>
+        <w:t xml:space="preserve">Step 5: Review Your Progress</w:t>
+      </w:r>
+    </w:p>
+    <w:p>
+      <w:pPr>
+        <w:pStyle w:val="FirstParagraph"/>
+      </w:pPr>
+      <w:r>
+        <w:t xml:space="preserve">Open the</w:t>
+      </w:r>
+      <w:r>
+        <w:t xml:space="preserve"> </w:t>
+      </w:r>
+      <w:r>
+        <w:rPr>
+          <w:rStyle w:val="VerbatimChar"/>
+        </w:rPr>
+        <w:t xml:space="preserve">Progress</w:t>
+      </w:r>
+      <w:r>
+        <w:t xml:space="preserve"> </w:t>
+      </w:r>
+      <w:r>
+        <w:t xml:space="preserve">page from the main navigation to see a broader view of your advancement.</w:t>
+      </w:r>
+    </w:p>
+    <w:p>
+      <w:pPr>
+        <w:pStyle w:val="BodyText"/>
+      </w:pPr>
+      <w:r>
+        <w:t xml:space="preserve">The progress map displays all four exam domains. For each domain, you can review:</w:t>
+      </w:r>
+    </w:p>
+    <w:p>
+      <w:pPr>
+        <w:pStyle w:val="Compact"/>
+        <w:numPr>
+          <w:ilvl w:val="0"/>
+          <w:numId w:val="1021"/>
+        </w:numPr>
+      </w:pPr>
+      <w:r>
+        <w:t xml:space="preserve">the domain name</w:t>
+      </w:r>
+    </w:p>
+    <w:p>
+      <w:pPr>
+        <w:pStyle w:val="Compact"/>
+        <w:numPr>
+          <w:ilvl w:val="0"/>
+          <w:numId w:val="1021"/>
+        </w:numPr>
+      </w:pPr>
+      <w:r>
+        <w:t xml:space="preserve">the official exam weight</w:t>
+      </w:r>
+    </w:p>
+    <w:p>
+      <w:pPr>
+        <w:pStyle w:val="Compact"/>
+        <w:numPr>
+          <w:ilvl w:val="0"/>
+          <w:numId w:val="1021"/>
+        </w:numPr>
+      </w:pPr>
+      <w:r>
+        <w:t xml:space="preserve">your completion percentage</w:t>
+      </w:r>
+    </w:p>
+    <w:p>
+      <w:pPr>
+        <w:pStyle w:val="Compact"/>
+        <w:numPr>
+          <w:ilvl w:val="0"/>
+          <w:numId w:val="1021"/>
+        </w:numPr>
+      </w:pPr>
+      <w:r>
+        <w:t xml:space="preserve">whether the domain is still locked at</w:t>
+      </w:r>
+      <w:r>
+        <w:t xml:space="preserve"> </w:t>
+      </w:r>
+      <w:r>
+        <w:rPr>
+          <w:rStyle w:val="VerbatimChar"/>
+        </w:rPr>
+        <w:t xml:space="preserve">0%</w:t>
+      </w:r>
+    </w:p>
+    <w:p>
+      <w:pPr>
+        <w:pStyle w:val="FirstParagraph"/>
+      </w:pPr>
+      <w:r>
+        <w:t xml:space="preserve">This page is useful for identifying gaps and measuring improvement over time.</w:t>
+      </w:r>
+    </w:p>
+    <w:bookmarkEnd w:id="30"/>
+    <w:bookmarkStart w:id="31" w:name="navigation"/>
+    <w:p>
+      <w:pPr>
+        <w:pStyle w:val="Heading2"/>
+      </w:pPr>
+      <w:r>
+        <w:t xml:space="preserve">Navigation</w:t>
+      </w:r>
+    </w:p>
+    <w:p>
+      <w:pPr>
+        <w:pStyle w:val="FirstParagraph"/>
+      </w:pPr>
+      <w:r>
+        <w:t xml:space="preserve">Outside of an active session, the main navigation provides access to:</w:t>
+      </w:r>
+    </w:p>
+    <w:p>
+      <w:pPr>
+        <w:pStyle w:val="Compact"/>
+        <w:numPr>
+          <w:ilvl w:val="0"/>
+          <w:numId w:val="1022"/>
+        </w:numPr>
+      </w:pPr>
+      <w:r>
+        <w:rPr>
+          <w:rStyle w:val="VerbatimChar"/>
+        </w:rPr>
+        <w:t xml:space="preserve">Dashboard</w:t>
+      </w:r>
+    </w:p>
+    <w:p>
+      <w:pPr>
+        <w:pStyle w:val="Compact"/>
+        <w:numPr>
+          <w:ilvl w:val="0"/>
+          <w:numId w:val="1022"/>
+        </w:numPr>
+      </w:pPr>
+      <w:r>
+        <w:rPr>
+          <w:rStyle w:val="VerbatimChar"/>
+        </w:rPr>
+        <w:t xml:space="preserve">Progress</w:t>
+      </w:r>
+    </w:p>
+    <w:p>
+      <w:pPr>
+        <w:pStyle w:val="Compact"/>
+        <w:numPr>
+          <w:ilvl w:val="0"/>
+          <w:numId w:val="1022"/>
+        </w:numPr>
+      </w:pPr>
+      <w:r>
+        <w:rPr>
+          <w:rStyle w:val="VerbatimChar"/>
+        </w:rPr>
+        <w:t xml:space="preserve">Start session</w:t>
+      </w:r>
+    </w:p>
+    <w:p>
+      <w:pPr>
+        <w:pStyle w:val="Compact"/>
+        <w:numPr>
+          <w:ilvl w:val="0"/>
+          <w:numId w:val="1022"/>
+        </w:numPr>
+      </w:pPr>
+      <w:r>
+        <w:rPr>
+          <w:rStyle w:val="VerbatimChar"/>
+        </w:rPr>
+        <w:t xml:space="preserve">Theme</w:t>
+      </w:r>
+      <w:r>
+        <w:t xml:space="preserve"> </w:t>
+      </w:r>
+      <w:r>
+        <w:t xml:space="preserve">(light, dark, or system)</w:t>
+      </w:r>
+    </w:p>
+    <w:p>
+      <w:pPr>
+        <w:pStyle w:val="FirstParagraph"/>
+      </w:pPr>
+      <w:r>
+        <w:t xml:space="preserve">During an active session, the interface becomes more focused to reduce distractions.</w:t>
+      </w:r>
+    </w:p>
+    <w:bookmarkEnd w:id="31"/>
+    <w:bookmarkStart w:id="32" w:name="returning-to-an-in-progress-session"/>
+    <w:p>
+      <w:pPr>
+        <w:pStyle w:val="Heading2"/>
+      </w:pPr>
+      <w:r>
+        <w:t xml:space="preserve">Returning to an In-Progress Session</w:t>
+      </w:r>
+    </w:p>
+    <w:p>
+      <w:pPr>
+        <w:pStyle w:val="FirstParagraph"/>
+      </w:pPr>
+      <w:r>
+        <w:t xml:space="preserve">If you leave the app during a session and return later, Gauntlet attempts to restore your in-progress session automatically.</w:t>
+      </w:r>
+    </w:p>
+    <w:p>
+      <w:pPr>
+        <w:pStyle w:val="BodyText"/>
+      </w:pPr>
+      <w:r>
+        <w:t xml:space="preserve">In most cases, this allows you to continue without losing your place.</w:t>
+      </w:r>
+    </w:p>
+    <w:bookmarkEnd w:id="32"/>
+    <w:bookmarkStart w:id="38" w:name="common-messages"/>
+    <w:p>
+      <w:pPr>
+        <w:pStyle w:val="Heading2"/>
+      </w:pPr>
+      <w:r>
+        <w:t xml:space="preserve">Common Messages</w:t>
+      </w:r>
+    </w:p>
+    <w:bookmarkStart w:id="33" w:name="Xf17613760e232ec50407d41d82a9f4bb101c158"/>
+    <w:p>
+      <w:pPr>
+        <w:pStyle w:val="Heading3"/>
+      </w:pPr>
+      <w:r>
+        <w:t xml:space="preserve">“Rex couldn’t generate a challenge. Try again.”</w:t>
+      </w:r>
+    </w:p>
+    <w:p>
+      <w:pPr>
+        <w:pStyle w:val="FirstParagraph"/>
+      </w:pPr>
+      <w:r>
+        <w:t xml:space="preserve">Select</w:t>
+      </w:r>
+      <w:r>
+        <w:t xml:space="preserve"> </w:t>
+      </w:r>
+      <w:r>
+        <w:rPr>
+          <w:rStyle w:val="VerbatimChar"/>
+        </w:rPr>
+        <w:t xml:space="preserve">Retry</w:t>
       </w:r>
       <w:r>
         <w:t xml:space="preserve">.</w:t>
       </w:r>
     </w:p>
-    <w:bookmarkEnd w:id="28"/>
-    <w:bookmarkStart w:id="29" w:name="step-5-review-your-progress"/>
+    <w:bookmarkEnd w:id="33"/>
+    <w:bookmarkStart w:id="34" w:name="X5e26936539b6d6b32753f590d819815d145ac26"/>
+    <w:p>
+      <w:pPr>
+        <w:pStyle w:val="Heading3"/>
+      </w:pPr>
+      <w:r>
+        <w:t xml:space="preserve">“Rex couldn’t generate a rechallenge. Try again.”</w:t>
+      </w:r>
+    </w:p>
+    <w:p>
+      <w:pPr>
+        <w:pStyle w:val="FirstParagraph"/>
+      </w:pPr>
+      <w:r>
+        <w:t xml:space="preserve">Select</w:t>
+      </w:r>
+      <w:r>
+        <w:t xml:space="preserve"> </w:t>
+      </w:r>
+      <w:r>
+        <w:rPr>
+          <w:rStyle w:val="VerbatimChar"/>
+        </w:rPr>
+        <w:t xml:space="preserve">Retry</w:t>
+      </w:r>
+      <w:r>
+        <w:t xml:space="preserve"> </w:t>
+      </w:r>
+      <w:r>
+        <w:t xml:space="preserve">to continue the current session.</w:t>
+      </w:r>
+    </w:p>
+    <w:bookmarkEnd w:id="34"/>
+    <w:bookmarkStart w:id="35" w:name="evaluation-failed.-try-again."/>
+    <w:p>
+      <w:pPr>
+        <w:pStyle w:val="Heading3"/>
+      </w:pPr>
+      <w:r>
+        <w:t xml:space="preserve">“Evaluation failed. Try again.”</w:t>
+      </w:r>
+    </w:p>
+    <w:p>
+      <w:pPr>
+        <w:pStyle w:val="FirstParagraph"/>
+      </w:pPr>
+      <w:r>
+        <w:t xml:space="preserve">Select</w:t>
+      </w:r>
+      <w:r>
+        <w:t xml:space="preserve"> </w:t>
+      </w:r>
+      <w:r>
+        <w:rPr>
+          <w:rStyle w:val="VerbatimChar"/>
+        </w:rPr>
+        <w:t xml:space="preserve">Retry</w:t>
+      </w:r>
+      <w:r>
+        <w:t xml:space="preserve">, then resubmit your answer if needed.</w:t>
+      </w:r>
+    </w:p>
+    <w:bookmarkEnd w:id="35"/>
+    <w:bookmarkStart w:id="36" w:name="Xd398c57e91b2e57033ffa9a28ee63069b8ad0ac"/>
+    <w:p>
+      <w:pPr>
+        <w:pStyle w:val="Heading3"/>
+      </w:pPr>
+      <w:r>
+        <w:t xml:space="preserve">“We couldn’t restore your session. Retry in a moment.”</w:t>
+      </w:r>
+    </w:p>
+    <w:p>
+      <w:pPr>
+        <w:pStyle w:val="FirstParagraph"/>
+      </w:pPr>
+      <w:r>
+        <w:t xml:space="preserve">Wait a few seconds, then try again.</w:t>
+      </w:r>
+    </w:p>
+    <w:bookmarkEnd w:id="36"/>
+    <w:bookmarkStart w:id="37" w:name="X9d5682c7f4872617064921f779e329a6ecb8bb7"/>
+    <w:p>
+      <w:pPr>
+        <w:pStyle w:val="Heading3"/>
+      </w:pPr>
+      <w:r>
+        <w:t xml:space="preserve">“Dashboard is waiting for the agent service.”</w:t>
+      </w:r>
+    </w:p>
+    <w:p>
+      <w:pPr>
+        <w:pStyle w:val="FirstParagraph"/>
+      </w:pPr>
+      <w:r>
+        <w:t xml:space="preserve">The backend service may still be starting. Refresh the page after a short wait.</w:t>
+      </w:r>
+    </w:p>
+    <w:bookmarkEnd w:id="37"/>
+    <w:bookmarkEnd w:id="38"/>
+    <w:bookmarkStart w:id="39" w:name="recommended-daily-use"/>
     <w:p>
       <w:pPr>
         <w:pStyle w:val="Heading2"/>
       </w:pPr>
       <w:r>
-        <w:t xml:space="preserve">Step 5: Review Your Progress</w:t>
+        <w:t xml:space="preserve">Recommended Daily Use</w:t>
       </w:r>
     </w:p>
     <w:p>
@@ -1361,7 +1904,101 @@
         <w:pStyle w:val="FirstParagraph"/>
       </w:pPr>
       <w:r>
-        <w:t xml:space="preserve">Open the</w:t>
+        <w:t xml:space="preserve">For the best experience:</w:t>
+      </w:r>
+    </w:p>
+    <w:p>
+      <w:pPr>
+        <w:pStyle w:val="Compact"/>
+        <w:numPr>
+          <w:ilvl w:val="0"/>
+          <w:numId w:val="1023"/>
+        </w:numPr>
+      </w:pPr>
+      <w:r>
+        <w:t xml:space="preserve">Start from the dashboard each day.</w:t>
+      </w:r>
+    </w:p>
+    <w:p>
+      <w:pPr>
+        <w:pStyle w:val="Compact"/>
+        <w:numPr>
+          <w:ilvl w:val="0"/>
+          <w:numId w:val="1023"/>
+        </w:numPr>
+      </w:pPr>
+      <w:r>
+        <w:t xml:space="preserve">Complete at least one full session.</w:t>
+      </w:r>
+    </w:p>
+    <w:p>
+      <w:pPr>
+        <w:pStyle w:val="Compact"/>
+        <w:numPr>
+          <w:ilvl w:val="0"/>
+          <w:numId w:val="1023"/>
+        </w:numPr>
+      </w:pPr>
+      <w:r>
+        <w:t xml:space="preserve">Read Sage’s explanations closely, including after correct answers.</w:t>
+      </w:r>
+    </w:p>
+    <w:p>
+      <w:pPr>
+        <w:pStyle w:val="Compact"/>
+        <w:numPr>
+          <w:ilvl w:val="0"/>
+          <w:numId w:val="1023"/>
+        </w:numPr>
+      </w:pPr>
+      <w:r>
+        <w:t xml:space="preserve">Review the progress map to identify weaker domains.</w:t>
+      </w:r>
+    </w:p>
+    <w:p>
+      <w:pPr>
+        <w:pStyle w:val="Compact"/>
+        <w:numPr>
+          <w:ilvl w:val="0"/>
+          <w:numId w:val="1023"/>
+        </w:numPr>
+      </w:pPr>
+      <w:r>
+        <w:t xml:space="preserve">Repeat consistently as your readiness score improves.</w:t>
+      </w:r>
+    </w:p>
+    <w:bookmarkEnd w:id="39"/>
+    <w:bookmarkStart w:id="40" w:name="quick-start-checklist"/>
+    <w:p>
+      <w:pPr>
+        <w:pStyle w:val="Heading2"/>
+      </w:pPr>
+      <w:r>
+        <w:t xml:space="preserve">Quick Start Checklist</w:t>
+      </w:r>
+    </w:p>
+    <w:p>
+      <w:pPr>
+        <w:pStyle w:val="Compact"/>
+        <w:numPr>
+          <w:ilvl w:val="0"/>
+          <w:numId w:val="1024"/>
+        </w:numPr>
+      </w:pPr>
+      <w:r>
+        <w:t xml:space="preserve">Open the app.</w:t>
+      </w:r>
+    </w:p>
+    <w:p>
+      <w:pPr>
+        <w:pStyle w:val="Compact"/>
+        <w:numPr>
+          <w:ilvl w:val="0"/>
+          <w:numId w:val="1024"/>
+        </w:numPr>
+      </w:pPr>
+      <w:r>
+        <w:t xml:space="preserve">Complete onboarding with</w:t>
       </w:r>
       <w:r>
         <w:t xml:space="preserve"> </w:t>
@@ -1370,514 +2007,93 @@
         <w:rPr>
           <w:rStyle w:val="VerbatimChar"/>
         </w:rPr>
-        <w:t xml:space="preserve">Progress</w:t>
+        <w:t xml:space="preserve">DVA-C02</w:t>
+      </w:r>
+      <w:r>
+        <w:t xml:space="preserve">.</w:t>
+      </w:r>
+    </w:p>
+    <w:p>
+      <w:pPr>
+        <w:pStyle w:val="Compact"/>
+        <w:numPr>
+          <w:ilvl w:val="0"/>
+          <w:numId w:val="1024"/>
+        </w:numPr>
+      </w:pPr>
+      <w:r>
+        <w:t xml:space="preserve">Choose a learning style.</w:t>
+      </w:r>
+    </w:p>
+    <w:p>
+      <w:pPr>
+        <w:pStyle w:val="Compact"/>
+        <w:numPr>
+          <w:ilvl w:val="0"/>
+          <w:numId w:val="1024"/>
+        </w:numPr>
+      </w:pPr>
+      <w:r>
+        <w:t xml:space="preserve">Wait for the curriculum build to finish.</w:t>
+      </w:r>
+    </w:p>
+    <w:p>
+      <w:pPr>
+        <w:pStyle w:val="Compact"/>
+        <w:numPr>
+          <w:ilvl w:val="0"/>
+          <w:numId w:val="1024"/>
+        </w:numPr>
+      </w:pPr>
+      <w:r>
+        <w:t xml:space="preserve">Review the plan reveal.</w:t>
+      </w:r>
+    </w:p>
+    <w:p>
+      <w:pPr>
+        <w:pStyle w:val="Compact"/>
+        <w:numPr>
+          <w:ilvl w:val="0"/>
+          <w:numId w:val="1024"/>
+        </w:numPr>
+      </w:pPr>
+      <w:r>
+        <w:t xml:space="preserve">Open the dashboard.</w:t>
+      </w:r>
+    </w:p>
+    <w:p>
+      <w:pPr>
+        <w:pStyle w:val="Compact"/>
+        <w:numPr>
+          <w:ilvl w:val="0"/>
+          <w:numId w:val="1024"/>
+        </w:numPr>
+      </w:pPr>
+      <w:r>
+        <w:t xml:space="preserve">Start, resume, or begin another session from the</w:t>
       </w:r>
       <w:r>
         <w:t xml:space="preserve"> </w:t>
       </w:r>
       <w:r>
-        <w:t xml:space="preserve">page from the main navigation to see a broader view of your advancement.</w:t>
-      </w:r>
-    </w:p>
-    <w:p>
-      <w:pPr>
-        <w:pStyle w:val="BodyText"/>
-      </w:pPr>
-      <w:r>
-        <w:t xml:space="preserve">The progress map displays all four exam domains. For each domain, you can review:</w:t>
-      </w:r>
-    </w:p>
-    <w:p>
-      <w:pPr>
-        <w:pStyle w:val="Compact"/>
-        <w:numPr>
-          <w:ilvl w:val="0"/>
-          <w:numId w:val="1018"/>
-        </w:numPr>
-      </w:pPr>
-      <w:r>
-        <w:t xml:space="preserve">the domain name</w:t>
-      </w:r>
-    </w:p>
-    <w:p>
-      <w:pPr>
-        <w:pStyle w:val="Compact"/>
-        <w:numPr>
-          <w:ilvl w:val="0"/>
-          <w:numId w:val="1018"/>
-        </w:numPr>
-      </w:pPr>
-      <w:r>
-        <w:t xml:space="preserve">the official exam weight</w:t>
-      </w:r>
-    </w:p>
-    <w:p>
-      <w:pPr>
-        <w:pStyle w:val="Compact"/>
-        <w:numPr>
-          <w:ilvl w:val="0"/>
-          <w:numId w:val="1018"/>
-        </w:numPr>
-      </w:pPr>
-      <w:r>
-        <w:t xml:space="preserve">your completion percentage</w:t>
-      </w:r>
-    </w:p>
-    <w:p>
-      <w:pPr>
-        <w:pStyle w:val="Compact"/>
-        <w:numPr>
-          <w:ilvl w:val="0"/>
-          <w:numId w:val="1018"/>
-        </w:numPr>
-      </w:pPr>
-      <w:r>
-        <w:t xml:space="preserve">whether the domain is still locked at</w:t>
+        <w:rPr>
+          <w:rStyle w:val="VerbatimChar"/>
+        </w:rPr>
+        <w:t xml:space="preserve">Next up</w:t>
       </w:r>
       <w:r>
         <w:t xml:space="preserve"> </w:t>
       </w:r>
       <w:r>
-        <w:rPr>
-          <w:rStyle w:val="VerbatimChar"/>
-        </w:rPr>
-        <w:t xml:space="preserve">0%</w:t>
-      </w:r>
-    </w:p>
-    <w:p>
-      <w:pPr>
-        <w:pStyle w:val="FirstParagraph"/>
-      </w:pPr>
-      <w:r>
-        <w:t xml:space="preserve">This page is useful for identifying gaps and measuring improvement over time.</w:t>
-      </w:r>
-    </w:p>
-    <w:bookmarkEnd w:id="29"/>
-    <w:bookmarkStart w:id="30" w:name="navigation"/>
-    <w:p>
-      <w:pPr>
-        <w:pStyle w:val="Heading2"/>
-      </w:pPr>
-      <w:r>
-        <w:t xml:space="preserve">Navigation</w:t>
-      </w:r>
-    </w:p>
-    <w:p>
-      <w:pPr>
-        <w:pStyle w:val="FirstParagraph"/>
-      </w:pPr>
-      <w:r>
-        <w:t xml:space="preserve">Outside of an active session, the main navigation provides access to:</w:t>
-      </w:r>
-    </w:p>
-    <w:p>
-      <w:pPr>
-        <w:pStyle w:val="Compact"/>
-        <w:numPr>
-          <w:ilvl w:val="0"/>
-          <w:numId w:val="1019"/>
-        </w:numPr>
-      </w:pPr>
-      <w:r>
-        <w:rPr>
-          <w:rStyle w:val="VerbatimChar"/>
-        </w:rPr>
-        <w:t xml:space="preserve">Dashboard</w:t>
-      </w:r>
-    </w:p>
-    <w:p>
-      <w:pPr>
-        <w:pStyle w:val="Compact"/>
-        <w:numPr>
-          <w:ilvl w:val="0"/>
-          <w:numId w:val="1019"/>
-        </w:numPr>
-      </w:pPr>
-      <w:r>
-        <w:rPr>
-          <w:rStyle w:val="VerbatimChar"/>
-        </w:rPr>
-        <w:t xml:space="preserve">Progress</w:t>
-      </w:r>
-    </w:p>
-    <w:p>
-      <w:pPr>
-        <w:pStyle w:val="Compact"/>
-        <w:numPr>
-          <w:ilvl w:val="0"/>
-          <w:numId w:val="1019"/>
-        </w:numPr>
-      </w:pPr>
-      <w:r>
-        <w:rPr>
-          <w:rStyle w:val="VerbatimChar"/>
-        </w:rPr>
-        <w:t xml:space="preserve">Start session</w:t>
-      </w:r>
-    </w:p>
-    <w:p>
-      <w:pPr>
-        <w:pStyle w:val="FirstParagraph"/>
-      </w:pPr>
-      <w:r>
-        <w:t xml:space="preserve">During an active session, the interface becomes more focused to reduce distractions.</w:t>
-      </w:r>
-    </w:p>
-    <w:bookmarkEnd w:id="30"/>
-    <w:bookmarkStart w:id="31" w:name="returning-to-an-in-progress-session"/>
-    <w:p>
-      <w:pPr>
-        <w:pStyle w:val="Heading2"/>
-      </w:pPr>
-      <w:r>
-        <w:t xml:space="preserve">Returning to an In-Progress Session</w:t>
-      </w:r>
-    </w:p>
-    <w:p>
-      <w:pPr>
-        <w:pStyle w:val="FirstParagraph"/>
-      </w:pPr>
-      <w:r>
-        <w:t xml:space="preserve">If you leave the app during a session and return later, Gauntlet attempts to restore your in-progress session automatically.</w:t>
-      </w:r>
-    </w:p>
-    <w:p>
-      <w:pPr>
-        <w:pStyle w:val="BodyText"/>
-      </w:pPr>
-      <w:r>
-        <w:t xml:space="preserve">In most cases, this allows you to continue without losing your place.</w:t>
-      </w:r>
-    </w:p>
-    <w:bookmarkEnd w:id="31"/>
-    <w:bookmarkStart w:id="37" w:name="common-messages"/>
-    <w:p>
-      <w:pPr>
-        <w:pStyle w:val="Heading2"/>
-      </w:pPr>
-      <w:r>
-        <w:t xml:space="preserve">Common Messages</w:t>
-      </w:r>
-    </w:p>
-    <w:bookmarkStart w:id="32" w:name="Xf17613760e232ec50407d41d82a9f4bb101c158"/>
-    <w:p>
-      <w:pPr>
-        <w:pStyle w:val="Heading3"/>
-      </w:pPr>
-      <w:r>
-        <w:t xml:space="preserve">“Rex couldn’t generate a challenge. Try again.”</w:t>
-      </w:r>
-    </w:p>
-    <w:p>
-      <w:pPr>
-        <w:pStyle w:val="FirstParagraph"/>
-      </w:pPr>
-      <w:r>
-        <w:t xml:space="preserve">Select</w:t>
-      </w:r>
-      <w:r>
-        <w:t xml:space="preserve"> </w:t>
-      </w:r>
-      <w:r>
-        <w:rPr>
-          <w:rStyle w:val="VerbatimChar"/>
-        </w:rPr>
-        <w:t xml:space="preserve">Retry</w:t>
-      </w:r>
-      <w:r>
-        <w:t xml:space="preserve">.</w:t>
-      </w:r>
-    </w:p>
-    <w:bookmarkEnd w:id="32"/>
-    <w:bookmarkStart w:id="33" w:name="X5e26936539b6d6b32753f590d819815d145ac26"/>
-    <w:p>
-      <w:pPr>
-        <w:pStyle w:val="Heading3"/>
-      </w:pPr>
-      <w:r>
-        <w:t xml:space="preserve">“Rex couldn’t generate a rechallenge. Try again.”</w:t>
-      </w:r>
-    </w:p>
-    <w:p>
-      <w:pPr>
-        <w:pStyle w:val="FirstParagraph"/>
-      </w:pPr>
-      <w:r>
-        <w:t xml:space="preserve">Select</w:t>
-      </w:r>
-      <w:r>
-        <w:t xml:space="preserve"> </w:t>
-      </w:r>
-      <w:r>
-        <w:rPr>
-          <w:rStyle w:val="VerbatimChar"/>
-        </w:rPr>
-        <w:t xml:space="preserve">Retry</w:t>
-      </w:r>
-      <w:r>
-        <w:t xml:space="preserve"> </w:t>
-      </w:r>
-      <w:r>
-        <w:t xml:space="preserve">to continue the current session.</w:t>
-      </w:r>
-    </w:p>
-    <w:bookmarkEnd w:id="33"/>
-    <w:bookmarkStart w:id="34" w:name="evaluation-failed.-try-again."/>
-    <w:p>
-      <w:pPr>
-        <w:pStyle w:val="Heading3"/>
-      </w:pPr>
-      <w:r>
-        <w:t xml:space="preserve">“Evaluation failed. Try again.”</w:t>
-      </w:r>
-    </w:p>
-    <w:p>
-      <w:pPr>
-        <w:pStyle w:val="FirstParagraph"/>
-      </w:pPr>
-      <w:r>
-        <w:t xml:space="preserve">Select</w:t>
-      </w:r>
-      <w:r>
-        <w:t xml:space="preserve"> </w:t>
-      </w:r>
-      <w:r>
-        <w:rPr>
-          <w:rStyle w:val="VerbatimChar"/>
-        </w:rPr>
-        <w:t xml:space="preserve">Retry</w:t>
-      </w:r>
-      <w:r>
-        <w:t xml:space="preserve">, then resubmit your answer if needed.</w:t>
-      </w:r>
-    </w:p>
-    <w:bookmarkEnd w:id="34"/>
-    <w:bookmarkStart w:id="35" w:name="Xd398c57e91b2e57033ffa9a28ee63069b8ad0ac"/>
-    <w:p>
-      <w:pPr>
-        <w:pStyle w:val="Heading3"/>
-      </w:pPr>
-      <w:r>
-        <w:t xml:space="preserve">“We couldn’t restore your session. Retry in a moment.”</w:t>
-      </w:r>
-    </w:p>
-    <w:p>
-      <w:pPr>
-        <w:pStyle w:val="FirstParagraph"/>
-      </w:pPr>
-      <w:r>
-        <w:t xml:space="preserve">Wait a few seconds, then try again.</w:t>
-      </w:r>
-    </w:p>
-    <w:bookmarkEnd w:id="35"/>
-    <w:bookmarkStart w:id="36" w:name="X9d5682c7f4872617064921f779e329a6ecb8bb7"/>
-    <w:p>
-      <w:pPr>
-        <w:pStyle w:val="Heading3"/>
-      </w:pPr>
-      <w:r>
-        <w:t xml:space="preserve">“Dashboard is waiting for the agent service.”</w:t>
-      </w:r>
-    </w:p>
-    <w:p>
-      <w:pPr>
-        <w:pStyle w:val="FirstParagraph"/>
-      </w:pPr>
-      <w:r>
-        <w:t xml:space="preserve">The backend service may still be starting. Refresh the page after a short wait.</w:t>
-      </w:r>
-    </w:p>
-    <w:bookmarkEnd w:id="36"/>
-    <w:bookmarkEnd w:id="37"/>
-    <w:bookmarkStart w:id="38" w:name="recommended-daily-use"/>
-    <w:p>
-      <w:pPr>
-        <w:pStyle w:val="Heading2"/>
-      </w:pPr>
-      <w:r>
-        <w:t xml:space="preserve">Recommended Daily Use</w:t>
-      </w:r>
-    </w:p>
-    <w:p>
-      <w:pPr>
-        <w:pStyle w:val="FirstParagraph"/>
-      </w:pPr>
-      <w:r>
-        <w:t xml:space="preserve">For the best experience:</w:t>
-      </w:r>
-    </w:p>
-    <w:p>
-      <w:pPr>
-        <w:pStyle w:val="Compact"/>
-        <w:numPr>
-          <w:ilvl w:val="0"/>
-          <w:numId w:val="1020"/>
-        </w:numPr>
-      </w:pPr>
-      <w:r>
-        <w:t xml:space="preserve">Start from the dashboard each day.</w:t>
-      </w:r>
-    </w:p>
-    <w:p>
-      <w:pPr>
-        <w:pStyle w:val="Compact"/>
-        <w:numPr>
-          <w:ilvl w:val="0"/>
-          <w:numId w:val="1020"/>
-        </w:numPr>
-      </w:pPr>
-      <w:r>
-        <w:t xml:space="preserve">Complete at least one full session.</w:t>
-      </w:r>
-    </w:p>
-    <w:p>
-      <w:pPr>
-        <w:pStyle w:val="Compact"/>
-        <w:numPr>
-          <w:ilvl w:val="0"/>
-          <w:numId w:val="1020"/>
-        </w:numPr>
-      </w:pPr>
-      <w:r>
-        <w:t xml:space="preserve">Read Sage’s explanations closely, including after correct answers.</w:t>
-      </w:r>
-    </w:p>
-    <w:p>
-      <w:pPr>
-        <w:pStyle w:val="Compact"/>
-        <w:numPr>
-          <w:ilvl w:val="0"/>
-          <w:numId w:val="1020"/>
-        </w:numPr>
-      </w:pPr>
-      <w:r>
-        <w:t xml:space="preserve">Review the progress map to identify weaker domains.</w:t>
-      </w:r>
-    </w:p>
-    <w:p>
-      <w:pPr>
-        <w:pStyle w:val="Compact"/>
-        <w:numPr>
-          <w:ilvl w:val="0"/>
-          <w:numId w:val="1020"/>
-        </w:numPr>
-      </w:pPr>
-      <w:r>
-        <w:t xml:space="preserve">Repeat consistently as your readiness score improves.</w:t>
-      </w:r>
-    </w:p>
-    <w:bookmarkEnd w:id="38"/>
-    <w:bookmarkStart w:id="39" w:name="quick-start-checklist"/>
-    <w:p>
-      <w:pPr>
-        <w:pStyle w:val="Heading2"/>
-      </w:pPr>
-      <w:r>
-        <w:t xml:space="preserve">Quick Start Checklist</w:t>
-      </w:r>
-    </w:p>
-    <w:p>
-      <w:pPr>
-        <w:pStyle w:val="Compact"/>
-        <w:numPr>
-          <w:ilvl w:val="0"/>
-          <w:numId w:val="1021"/>
-        </w:numPr>
-      </w:pPr>
-      <w:r>
-        <w:t xml:space="preserve">Open the app.</w:t>
-      </w:r>
-    </w:p>
-    <w:p>
-      <w:pPr>
-        <w:pStyle w:val="Compact"/>
-        <w:numPr>
-          <w:ilvl w:val="0"/>
-          <w:numId w:val="1021"/>
-        </w:numPr>
-      </w:pPr>
-      <w:r>
-        <w:t xml:space="preserve">Complete onboarding with</w:t>
-      </w:r>
-      <w:r>
-        <w:t xml:space="preserve"> </w:t>
-      </w:r>
-      <w:r>
-        <w:rPr>
-          <w:rStyle w:val="VerbatimChar"/>
-        </w:rPr>
-        <w:t xml:space="preserve">DVA-C02</w:t>
-      </w:r>
-      <w:r>
-        <w:t xml:space="preserve">.</w:t>
-      </w:r>
-    </w:p>
-    <w:p>
-      <w:pPr>
-        <w:pStyle w:val="Compact"/>
-        <w:numPr>
-          <w:ilvl w:val="0"/>
-          <w:numId w:val="1021"/>
-        </w:numPr>
-      </w:pPr>
-      <w:r>
-        <w:t xml:space="preserve">Choose a learning style.</w:t>
-      </w:r>
-    </w:p>
-    <w:p>
-      <w:pPr>
-        <w:pStyle w:val="Compact"/>
-        <w:numPr>
-          <w:ilvl w:val="0"/>
-          <w:numId w:val="1021"/>
-        </w:numPr>
-      </w:pPr>
-      <w:r>
-        <w:t xml:space="preserve">Wait for the curriculum build to finish.</w:t>
-      </w:r>
-    </w:p>
-    <w:p>
-      <w:pPr>
-        <w:pStyle w:val="Compact"/>
-        <w:numPr>
-          <w:ilvl w:val="0"/>
-          <w:numId w:val="1021"/>
-        </w:numPr>
-      </w:pPr>
-      <w:r>
-        <w:t xml:space="preserve">Review the plan reveal.</w:t>
-      </w:r>
-    </w:p>
-    <w:p>
-      <w:pPr>
-        <w:pStyle w:val="Compact"/>
-        <w:numPr>
-          <w:ilvl w:val="0"/>
-          <w:numId w:val="1021"/>
-        </w:numPr>
-      </w:pPr>
-      <w:r>
-        <w:t xml:space="preserve">Open the dashboard.</w:t>
-      </w:r>
-    </w:p>
-    <w:p>
-      <w:pPr>
-        <w:pStyle w:val="Compact"/>
-        <w:numPr>
-          <w:ilvl w:val="0"/>
-          <w:numId w:val="1021"/>
-        </w:numPr>
-      </w:pPr>
-      <w:r>
-        <w:t xml:space="preserve">Start a session.</w:t>
-      </w:r>
-    </w:p>
-    <w:p>
-      <w:pPr>
-        <w:pStyle w:val="Compact"/>
-        <w:numPr>
-          <w:ilvl w:val="0"/>
-          <w:numId w:val="1021"/>
+        <w:t xml:space="preserve">card.</w:t>
+      </w:r>
+    </w:p>
+    <w:p>
+      <w:pPr>
+        <w:pStyle w:val="Compact"/>
+        <w:numPr>
+          <w:ilvl w:val="0"/>
+          <w:numId w:val="1024"/>
         </w:numPr>
       </w:pPr>
       <w:r>
@@ -1889,27 +2105,39 @@
         <w:pStyle w:val="Compact"/>
         <w:numPr>
           <w:ilvl w:val="0"/>
-          <w:numId w:val="1021"/>
-        </w:numPr>
-      </w:pPr>
-      <w:r>
-        <w:t xml:space="preserve">Review Sage’s feedback.</w:t>
-      </w:r>
-    </w:p>
-    <w:p>
-      <w:pPr>
-        <w:pStyle w:val="Compact"/>
-        <w:numPr>
-          <w:ilvl w:val="0"/>
-          <w:numId w:val="1021"/>
+          <w:numId w:val="1024"/>
+        </w:numPr>
+      </w:pPr>
+      <w:r>
+        <w:t xml:space="preserve">Review Sage’s formatted feedback.</w:t>
+      </w:r>
+    </w:p>
+    <w:p>
+      <w:pPr>
+        <w:pStyle w:val="Compact"/>
+        <w:numPr>
+          <w:ilvl w:val="0"/>
+          <w:numId w:val="1024"/>
+        </w:numPr>
+      </w:pPr>
+      <w:r>
+        <w:t xml:space="preserve">Choose to start another session or return to the dashboard.</w:t>
+      </w:r>
+    </w:p>
+    <w:p>
+      <w:pPr>
+        <w:pStyle w:val="Compact"/>
+        <w:numPr>
+          <w:ilvl w:val="0"/>
+          <w:numId w:val="1024"/>
         </w:numPr>
       </w:pPr>
       <w:r>
         <w:t xml:space="preserve">Check your progress.</w:t>
       </w:r>
     </w:p>
-    <w:bookmarkEnd w:id="39"/>
     <w:bookmarkEnd w:id="40"/>
+    <w:bookmarkEnd w:id="41"/>
     <w:sectPr>
       <w:footnotePr>
         <w:numRestart w:val="eachSect"/>
@@ -2323,34 +2551,7 @@
     <w:abstractNumId w:val="991"/>
   </w:num>
   <w:num w:numId="1011">
-    <w:abstractNumId w:val="99411"/>
-    <w:lvlOverride w:ilvl="0">
-      <w:startOverride w:val="1"/>
-    </w:lvlOverride>
-    <w:lvlOverride w:ilvl="1">
-      <w:startOverride w:val="1"/>
-    </w:lvlOverride>
-    <w:lvlOverride w:ilvl="2">
-      <w:startOverride w:val="1"/>
-    </w:lvlOverride>
-    <w:lvlOverride w:ilvl="3">
-      <w:startOverride w:val="1"/>
-    </w:lvlOverride>
-    <w:lvlOverride w:ilvl="4">
-      <w:startOverride w:val="1"/>
-    </w:lvlOverride>
-    <w:lvlOverride w:ilvl="5">
-      <w:startOverride w:val="1"/>
-    </w:lvlOverride>
-    <w:lvlOverride w:ilvl="6">
-      <w:startOverride w:val="1"/>
-    </w:lvlOverride>
-    <w:lvlOverride w:ilvl="7">
-      <w:startOverride w:val="1"/>
-    </w:lvlOverride>
-    <w:lvlOverride w:ilvl="8">
-      <w:startOverride w:val="1"/>
-    </w:lvlOverride>
+    <w:abstractNumId w:val="991"/>
   </w:num>
   <w:num w:numId="1012">
     <w:abstractNumId w:val="991"/>
@@ -2389,7 +2590,34 @@
     <w:abstractNumId w:val="991"/>
   </w:num>
   <w:num w:numId="1015">
-    <w:abstractNumId w:val="991"/>
+    <w:abstractNumId w:val="99411"/>
+    <w:lvlOverride w:ilvl="0">
+      <w:startOverride w:val="1"/>
+    </w:lvlOverride>
+    <w:lvlOverride w:ilvl="1">
+      <w:startOverride w:val="1"/>
+    </w:lvlOverride>
+    <w:lvlOverride w:ilvl="2">
+      <w:startOverride w:val="1"/>
+    </w:lvlOverride>
+    <w:lvlOverride w:ilvl="3">
+      <w:startOverride w:val="1"/>
+    </w:lvlOverride>
+    <w:lvlOverride w:ilvl="4">
+      <w:startOverride w:val="1"/>
+    </w:lvlOverride>
+    <w:lvlOverride w:ilvl="5">
+      <w:startOverride w:val="1"/>
+    </w:lvlOverride>
+    <w:lvlOverride w:ilvl="6">
+      <w:startOverride w:val="1"/>
+    </w:lvlOverride>
+    <w:lvlOverride w:ilvl="7">
+      <w:startOverride w:val="1"/>
+    </w:lvlOverride>
+    <w:lvlOverride w:ilvl="8">
+      <w:startOverride w:val="1"/>
+    </w:lvlOverride>
   </w:num>
   <w:num w:numId="1016">
     <w:abstractNumId w:val="991"/>
@@ -2404,6 +2632,15 @@
     <w:abstractNumId w:val="991"/>
   </w:num>
   <w:num w:numId="1020">
+    <w:abstractNumId w:val="991"/>
+  </w:num>
+  <w:num w:numId="1021">
+    <w:abstractNumId w:val="991"/>
+  </w:num>
+  <w:num w:numId="1022">
+    <w:abstractNumId w:val="991"/>
+  </w:num>
+  <w:num w:numId="1023">
     <w:abstractNumId w:val="99411"/>
     <w:lvlOverride w:ilvl="0">
       <w:startOverride w:val="1"/>
@@ -2433,7 +2670,7 @@
       <w:startOverride w:val="1"/>
     </w:lvlOverride>
   </w:num>
-  <w:num w:numId="1021">
+  <w:num w:numId="1024">
     <w:abstractNumId w:val="99411"/>
     <w:lvlOverride w:ilvl="0">
       <w:startOverride w:val="1"/>

</xml_diff>